<commit_message>
Complete Turn & Talk scaffolding across all remaining lessons + flagships
</commit_message>
<xml_diff>
--- a/lessons/1-1-flagship/downloads/1-1-flagship-notes.docx
+++ b/lessons/1-1-flagship/downloads/1-1-flagship-notes.docx
@@ -363,6 +363,800 @@
         <w:rPr>
           <w:b/>
           <w:bCs/>
+          <w:color w:val="1FA6A2"/>
+          <w:sz w:val="26"/>
+          <w:szCs w:val="26"/>
+        </w:rPr>
+        <w:t xml:space="preserve">Turn &amp; Talk — Discussion Points  (Level 1 support · Level 2)</w:t>
+      </w:r>
+    </w:p>
+    <w:p>
+      <w:pPr>
+        <w:spacing w:after="60"/>
+      </w:pPr>
+      <w:r>
+        <w:rPr>
+          <w:i/>
+          <w:iCs/>
+          <w:color w:val="5F6F80"/>
+          <w:sz w:val="19"/>
+          <w:szCs w:val="19"/>
+        </w:rPr>
+        <w:t xml:space="preserve">Talk with a partner. Use the Level 1 stems if you need help getting started; try the Level 2 question when you are ready for more.</w:t>
+      </w:r>
+    </w:p>
+    <w:p>
+      <w:pPr>
+        <w:spacing w:after="60"/>
+      </w:pPr>
+      <w:r>
+        <w:rPr>
+          <w:b/>
+          <w:bCs/>
+          <w:color w:val="12355B"/>
+          <w:sz w:val="21"/>
+          <w:szCs w:val="21"/>
+        </w:rPr>
+        <w:t xml:space="preserve">1. [Launch] </w:t>
+      </w:r>
+      <w:r>
+        <w:rPr>
+          <w:b/>
+          <w:bCs/>
+          <w:sz w:val="21"/>
+          <w:szCs w:val="21"/>
+        </w:rPr>
+        <w:t xml:space="preserve">The freighter docks with 48 cargo containers, and each storage pod only holds groups built from prime-numbered units. Is 48 prime or composite, and how can you tell before building a factor tree?</w:t>
+      </w:r>
+    </w:p>
+    <w:p>
+      <w:pPr>
+        <w:spacing w:after="60"/>
+      </w:pPr>
+      <w:r>
+        <w:rPr>
+          <w:b/>
+          <w:bCs/>
+          <w:color w:val="1FA6A2"/>
+          <w:sz w:val="20"/>
+          <w:szCs w:val="20"/>
+        </w:rPr>
+        <w:t xml:space="preserve">Level 1 — Start here: </w:t>
+      </w:r>
+      <w:r>
+        <w:rPr>
+          <w:sz w:val="20"/>
+          <w:szCs w:val="20"/>
+        </w:rPr>
+        <w:t xml:space="preserve">48 is composite because it has more than two factors.</w:t>
+      </w:r>
+    </w:p>
+    <w:p>
+      <w:pPr>
+        <w:spacing w:after="60"/>
+      </w:pPr>
+      <w:r>
+        <w:rPr>
+          <w:sz w:val="21"/>
+          <w:szCs w:val="21"/>
+        </w:rPr>
+        <w:t xml:space="preserve">48 is a ___ number because it has ___.</w:t>
+      </w:r>
+      <w:r>
+        <w:rPr>
+          <w:i/>
+          <w:iCs/>
+          <w:color w:val="5F6F80"/>
+          <w:sz w:val="19"/>
+          <w:szCs w:val="19"/>
+        </w:rPr>
+        <w:br/>
+        <w:t xml:space="preserve">
+48 es un número ___ porque tiene ___.</w:t>
+      </w:r>
+    </w:p>
+    <w:p>
+      <w:pPr>
+        <w:spacing w:after="60"/>
+      </w:pPr>
+      <w:r>
+        <w:rPr>
+          <w:sz w:val="21"/>
+          <w:szCs w:val="21"/>
+        </w:rPr>
+        <w:t xml:space="preserve">I can tell before factoring because ___.</w:t>
+      </w:r>
+      <w:r>
+        <w:rPr>
+          <w:i/>
+          <w:iCs/>
+          <w:color w:val="5F6F80"/>
+          <w:sz w:val="19"/>
+          <w:szCs w:val="19"/>
+        </w:rPr>
+        <w:br/>
+        <w:t xml:space="preserve">
+Puedo saberlo antes de factorizar porque ___.</w:t>
+      </w:r>
+    </w:p>
+    <w:p>
+      <w:pPr>
+        <w:spacing w:after="60"/>
+      </w:pPr>
+      <w:r>
+        <w:rPr>
+          <w:b/>
+          <w:bCs/>
+          <w:color w:val="12355B"/>
+          <w:sz w:val="20"/>
+          <w:szCs w:val="20"/>
+        </w:rPr>
+        <w:t xml:space="preserve">Word bank: </w:t>
+      </w:r>
+      <w:r>
+        <w:rPr>
+          <w:color w:val="1FA6A2"/>
+          <w:sz w:val="20"/>
+          <w:szCs w:val="20"/>
+        </w:rPr>
+        <w:t xml:space="preserve">prime number, composite number, factor, divisible, factor tree</w:t>
+      </w:r>
+    </w:p>
+    <w:p>
+      <w:pPr>
+        <w:spacing w:after="60"/>
+      </w:pPr>
+      <w:r>
+        <w:rPr>
+          <w:b/>
+          <w:bCs/>
+          <w:color w:val="12355B"/>
+          <w:sz w:val="19"/>
+          <w:szCs w:val="19"/>
+        </w:rPr>
+        <w:t xml:space="preserve">Listen for: </w:t>
+      </w:r>
+      <w:r>
+        <w:rPr>
+          <w:i/>
+          <w:iCs/>
+          <w:color w:val="5F6F80"/>
+          <w:sz w:val="19"/>
+          <w:szCs w:val="19"/>
+        </w:rPr>
+        <w:t xml:space="preserve">Students say 48 is composite because it has more than two factors (divisible by 2, 3, 4, 6, ...), so it can be broken into smaller groups.</w:t>
+      </w:r>
+    </w:p>
+    <w:p>
+      <w:pPr>
+        <w:spacing w:after="60"/>
+      </w:pPr>
+      <w:r>
+        <w:rPr>
+          <w:b/>
+          <w:bCs/>
+          <w:color w:val="9A6B12"/>
+          <w:sz w:val="20"/>
+          <w:szCs w:val="20"/>
+        </w:rPr>
+        <w:t xml:space="preserve">Level 2: </w:t>
+      </w:r>
+      <w:r>
+        <w:rPr>
+          <w:sz w:val="20"/>
+          <w:szCs w:val="20"/>
+        </w:rPr>
+        <w:t xml:space="preserve">Why can a prime-numbered shipment, like 47 containers, NOT be split into smaller equal prime groups? Justify with the definition of prime.</w:t>
+      </w:r>
+    </w:p>
+    <w:p>
+      <w:pPr>
+        <w:spacing w:after="60"/>
+        <w:ind w:left="360"/>
+      </w:pPr>
+      <w:r>
+        <w:rPr>
+          <w:sz w:val="20"/>
+          <w:szCs w:val="20"/>
+        </w:rPr>
+        <w:t xml:space="preserve">• 47 cannot be split because its only factors are ___.</w:t>
+      </w:r>
+    </w:p>
+    <w:p>
+      <w:pPr>
+        <w:spacing w:after="60"/>
+        <w:ind w:left="360"/>
+      </w:pPr>
+      <w:r>
+        <w:rPr>
+          <w:sz w:val="20"/>
+          <w:szCs w:val="20"/>
+        </w:rPr>
+        <w:t xml:space="preserve">• A prime number's factor tree would ___ because ___.</w:t>
+      </w:r>
+    </w:p>
+    <w:p>
+      <w:pPr>
+        <w:spacing w:after="60"/>
+      </w:pPr>
+      <w:r>
+        <w:rPr>
+          <w:b/>
+          <w:bCs/>
+          <w:color w:val="12355B"/>
+          <w:sz w:val="21"/>
+          <w:szCs w:val="21"/>
+        </w:rPr>
+        <w:t xml:space="preserve">2. [Explore] </w:t>
+      </w:r>
+      <w:r>
+        <w:rPr>
+          <w:b/>
+          <w:bCs/>
+          <w:sz w:val="21"/>
+          <w:szCs w:val="21"/>
+        </w:rPr>
+        <w:t xml:space="preserve">Look at your factor tree for 48. How did you decide which numbers to break apart first, and how did you know when to stop?</w:t>
+      </w:r>
+    </w:p>
+    <w:p>
+      <w:pPr>
+        <w:spacing w:after="60"/>
+      </w:pPr>
+      <w:r>
+        <w:rPr>
+          <w:b/>
+          <w:bCs/>
+          <w:color w:val="1FA6A2"/>
+          <w:sz w:val="20"/>
+          <w:szCs w:val="20"/>
+        </w:rPr>
+        <w:t xml:space="preserve">Level 1 — Start here: </w:t>
+      </w:r>
+      <w:r>
+        <w:rPr>
+          <w:sz w:val="20"/>
+          <w:szCs w:val="20"/>
+        </w:rPr>
+        <w:t xml:space="preserve">You keep splitting until every branch is a prime number.</w:t>
+      </w:r>
+    </w:p>
+    <w:p>
+      <w:pPr>
+        <w:spacing w:after="60"/>
+      </w:pPr>
+      <w:r>
+        <w:rPr>
+          <w:sz w:val="21"/>
+          <w:szCs w:val="21"/>
+        </w:rPr>
+        <w:t xml:space="preserve">I broke 48 into ___ first because ___.</w:t>
+      </w:r>
+      <w:r>
+        <w:rPr>
+          <w:i/>
+          <w:iCs/>
+          <w:color w:val="5F6F80"/>
+          <w:sz w:val="19"/>
+          <w:szCs w:val="19"/>
+        </w:rPr>
+        <w:br/>
+        <w:t xml:space="preserve">
+Separé 48 en ___ primero porque ___.</w:t>
+      </w:r>
+    </w:p>
+    <w:p>
+      <w:pPr>
+        <w:spacing w:after="60"/>
+      </w:pPr>
+      <w:r>
+        <w:rPr>
+          <w:sz w:val="21"/>
+          <w:szCs w:val="21"/>
+        </w:rPr>
+        <w:t xml:space="preserve">I knew I was finished when every factor was ___.</w:t>
+      </w:r>
+      <w:r>
+        <w:rPr>
+          <w:i/>
+          <w:iCs/>
+          <w:color w:val="5F6F80"/>
+          <w:sz w:val="19"/>
+          <w:szCs w:val="19"/>
+        </w:rPr>
+        <w:br/>
+        <w:t xml:space="preserve">
+Supe que terminé cuando cada factor era ___.</w:t>
+      </w:r>
+    </w:p>
+    <w:p>
+      <w:pPr>
+        <w:spacing w:after="60"/>
+      </w:pPr>
+      <w:r>
+        <w:rPr>
+          <w:b/>
+          <w:bCs/>
+          <w:color w:val="12355B"/>
+          <w:sz w:val="20"/>
+          <w:szCs w:val="20"/>
+        </w:rPr>
+        <w:t xml:space="preserve">Word bank: </w:t>
+      </w:r>
+      <w:r>
+        <w:rPr>
+          <w:color w:val="1FA6A2"/>
+          <w:sz w:val="20"/>
+          <w:szCs w:val="20"/>
+        </w:rPr>
+        <w:t xml:space="preserve">prime number, composite number, factor, factor tree, prime factorization</w:t>
+      </w:r>
+    </w:p>
+    <w:p>
+      <w:pPr>
+        <w:spacing w:after="60"/>
+      </w:pPr>
+      <w:r>
+        <w:rPr>
+          <w:b/>
+          <w:bCs/>
+          <w:color w:val="12355B"/>
+          <w:sz w:val="19"/>
+          <w:szCs w:val="19"/>
+        </w:rPr>
+        <w:t xml:space="preserve">Listen for: </w:t>
+      </w:r>
+      <w:r>
+        <w:rPr>
+          <w:i/>
+          <w:iCs/>
+          <w:color w:val="5F6F80"/>
+          <w:sz w:val="19"/>
+          <w:szCs w:val="19"/>
+        </w:rPr>
+        <w:t xml:space="preserve">Students explain they keep splitting composite branches and stop when every leaf is prime, ending with 48 = 2 × 2 × 2 × 2 × 3.</w:t>
+      </w:r>
+    </w:p>
+    <w:p>
+      <w:pPr>
+        <w:spacing w:after="60"/>
+      </w:pPr>
+      <w:r>
+        <w:rPr>
+          <w:b/>
+          <w:bCs/>
+          <w:color w:val="9A6B12"/>
+          <w:sz w:val="20"/>
+          <w:szCs w:val="20"/>
+        </w:rPr>
+        <w:t xml:space="preserve">Level 2: </w:t>
+      </w:r>
+      <w:r>
+        <w:rPr>
+          <w:sz w:val="20"/>
+          <w:szCs w:val="20"/>
+        </w:rPr>
+        <w:t xml:space="preserve">Write the prime factorization of 48 using exponents and explain what the exponent means in 2⁴ × 3.</w:t>
+      </w:r>
+    </w:p>
+    <w:p>
+      <w:pPr>
+        <w:spacing w:after="60"/>
+        <w:ind w:left="360"/>
+      </w:pPr>
+      <w:r>
+        <w:rPr>
+          <w:sz w:val="20"/>
+          <w:szCs w:val="20"/>
+        </w:rPr>
+        <w:t xml:space="preserve">• The prime factorization of 48 with exponents is ___.</w:t>
+      </w:r>
+    </w:p>
+    <w:p>
+      <w:pPr>
+        <w:spacing w:after="60"/>
+        <w:ind w:left="360"/>
+      </w:pPr>
+      <w:r>
+        <w:rPr>
+          <w:sz w:val="20"/>
+          <w:szCs w:val="20"/>
+        </w:rPr>
+        <w:t xml:space="preserve">• The exponent in 2⁴ means ___ because ___.</w:t>
+      </w:r>
+    </w:p>
+    <w:p>
+      <w:pPr>
+        <w:spacing w:after="60"/>
+      </w:pPr>
+      <w:r>
+        <w:rPr>
+          <w:b/>
+          <w:bCs/>
+          <w:color w:val="12355B"/>
+          <w:sz w:val="21"/>
+          <w:szCs w:val="21"/>
+        </w:rPr>
+        <w:t xml:space="preserve">3. [Connect] </w:t>
+      </w:r>
+      <w:r>
+        <w:rPr>
+          <w:b/>
+          <w:bCs/>
+          <w:sz w:val="21"/>
+          <w:szCs w:val="21"/>
+        </w:rPr>
+        <w:t xml:space="preserve">The cafeteria has 84 apples to arrange into equal rows. How does the prime factorization of 84 help the manager find every possible equal-row display?</w:t>
+      </w:r>
+    </w:p>
+    <w:p>
+      <w:pPr>
+        <w:spacing w:after="60"/>
+      </w:pPr>
+      <w:r>
+        <w:rPr>
+          <w:b/>
+          <w:bCs/>
+          <w:color w:val="1FA6A2"/>
+          <w:sz w:val="20"/>
+          <w:szCs w:val="20"/>
+        </w:rPr>
+        <w:t xml:space="preserve">Level 1 — Start here: </w:t>
+      </w:r>
+      <w:r>
+        <w:rPr>
+          <w:sz w:val="20"/>
+          <w:szCs w:val="20"/>
+        </w:rPr>
+        <w:t xml:space="preserve">Combining the prime factors of 84 builds all of its factors.</w:t>
+      </w:r>
+    </w:p>
+    <w:p>
+      <w:pPr>
+        <w:spacing w:after="60"/>
+      </w:pPr>
+      <w:r>
+        <w:rPr>
+          <w:sz w:val="21"/>
+          <w:szCs w:val="21"/>
+        </w:rPr>
+        <w:t xml:space="preserve">The prime factorization of 84 is ___.</w:t>
+      </w:r>
+      <w:r>
+        <w:rPr>
+          <w:i/>
+          <w:iCs/>
+          <w:color w:val="5F6F80"/>
+          <w:sz w:val="19"/>
+          <w:szCs w:val="19"/>
+        </w:rPr>
+        <w:br/>
+        <w:t xml:space="preserve">
+La factorización prima de 84 es ___.</w:t>
+      </w:r>
+    </w:p>
+    <w:p>
+      <w:pPr>
+        <w:spacing w:after="60"/>
+      </w:pPr>
+      <w:r>
+        <w:rPr>
+          <w:sz w:val="21"/>
+          <w:szCs w:val="21"/>
+        </w:rPr>
+        <w:t xml:space="preserve">The manager finds all the row sizes by ___ the prime factors.</w:t>
+      </w:r>
+      <w:r>
+        <w:rPr>
+          <w:i/>
+          <w:iCs/>
+          <w:color w:val="5F6F80"/>
+          <w:sz w:val="19"/>
+          <w:szCs w:val="19"/>
+        </w:rPr>
+        <w:br/>
+        <w:t xml:space="preserve">
+El gerente halla todos los tamaños de fila al ___ los factores primos.</w:t>
+      </w:r>
+    </w:p>
+    <w:p>
+      <w:pPr>
+        <w:spacing w:after="60"/>
+      </w:pPr>
+      <w:r>
+        <w:rPr>
+          <w:b/>
+          <w:bCs/>
+          <w:color w:val="12355B"/>
+          <w:sz w:val="20"/>
+          <w:szCs w:val="20"/>
+        </w:rPr>
+        <w:t xml:space="preserve">Word bank: </w:t>
+      </w:r>
+      <w:r>
+        <w:rPr>
+          <w:color w:val="1FA6A2"/>
+          <w:sz w:val="20"/>
+          <w:szCs w:val="20"/>
+        </w:rPr>
+        <w:t xml:space="preserve">prime factorization, factor, exponent, composite number, product</w:t>
+      </w:r>
+    </w:p>
+    <w:p>
+      <w:pPr>
+        <w:spacing w:after="60"/>
+      </w:pPr>
+      <w:r>
+        <w:rPr>
+          <w:b/>
+          <w:bCs/>
+          <w:color w:val="12355B"/>
+          <w:sz w:val="19"/>
+          <w:szCs w:val="19"/>
+        </w:rPr>
+        <w:t xml:space="preserve">Listen for: </w:t>
+      </w:r>
+      <w:r>
+        <w:rPr>
+          <w:i/>
+          <w:iCs/>
+          <w:color w:val="5F6F80"/>
+          <w:sz w:val="19"/>
+          <w:szCs w:val="19"/>
+        </w:rPr>
+        <w:t xml:space="preserve">Students give 84 = 2 × 2 × 3 × 7 = 2² × 3 × 7 and reason that multiplying combinations of those primes produces all factors of 84, which are the possible equal-row sizes.</w:t>
+      </w:r>
+    </w:p>
+    <w:p>
+      <w:pPr>
+        <w:spacing w:after="60"/>
+      </w:pPr>
+      <w:r>
+        <w:rPr>
+          <w:b/>
+          <w:bCs/>
+          <w:color w:val="9A6B12"/>
+          <w:sz w:val="20"/>
+          <w:szCs w:val="20"/>
+        </w:rPr>
+        <w:t xml:space="preserve">Level 2: </w:t>
+      </w:r>
+      <w:r>
+        <w:rPr>
+          <w:sz w:val="20"/>
+          <w:szCs w:val="20"/>
+        </w:rPr>
+        <w:t xml:space="preserve">Why does knowing the prime factorization of 84 make it faster to list all factors than checking every number from 1 to 84?</w:t>
+      </w:r>
+    </w:p>
+    <w:p>
+      <w:pPr>
+        <w:spacing w:after="60"/>
+        <w:ind w:left="360"/>
+      </w:pPr>
+      <w:r>
+        <w:rPr>
+          <w:sz w:val="20"/>
+          <w:szCs w:val="20"/>
+        </w:rPr>
+        <w:t xml:space="preserve">• Prime factorization is faster because ___.</w:t>
+      </w:r>
+    </w:p>
+    <w:p>
+      <w:pPr>
+        <w:spacing w:after="60"/>
+        <w:ind w:left="360"/>
+      </w:pPr>
+      <w:r>
+        <w:rPr>
+          <w:sz w:val="20"/>
+          <w:szCs w:val="20"/>
+        </w:rPr>
+        <w:t xml:space="preserve">• I can build factors by ___ instead of testing every number since ___.</w:t>
+      </w:r>
+    </w:p>
+    <w:p>
+      <w:pPr>
+        <w:spacing w:after="60"/>
+      </w:pPr>
+      <w:r>
+        <w:rPr>
+          <w:b/>
+          <w:bCs/>
+          <w:color w:val="12355B"/>
+          <w:sz w:val="21"/>
+          <w:szCs w:val="21"/>
+        </w:rPr>
+        <w:t xml:space="preserve">4. [Reflect] </w:t>
+      </w:r>
+      <w:r>
+        <w:rPr>
+          <w:b/>
+          <w:bCs/>
+          <w:sz w:val="21"/>
+          <w:szCs w:val="21"/>
+        </w:rPr>
+        <w:t xml:space="preserve">Why does every composite number have exactly one prime factorization, no matter how you start the factor tree?</w:t>
+      </w:r>
+    </w:p>
+    <w:p>
+      <w:pPr>
+        <w:spacing w:after="60"/>
+      </w:pPr>
+      <w:r>
+        <w:rPr>
+          <w:b/>
+          <w:bCs/>
+          <w:color w:val="1FA6A2"/>
+          <w:sz w:val="20"/>
+          <w:szCs w:val="20"/>
+        </w:rPr>
+        <w:t xml:space="preserve">Level 1 — Start here: </w:t>
+      </w:r>
+      <w:r>
+        <w:rPr>
+          <w:sz w:val="20"/>
+          <w:szCs w:val="20"/>
+        </w:rPr>
+        <w:t xml:space="preserve">Primes are unique building blocks, so the set of prime factors is always the same.</w:t>
+      </w:r>
+    </w:p>
+    <w:p>
+      <w:pPr>
+        <w:spacing w:after="60"/>
+      </w:pPr>
+      <w:r>
+        <w:rPr>
+          <w:sz w:val="21"/>
+          <w:szCs w:val="21"/>
+        </w:rPr>
+        <w:t xml:space="preserve">No matter how I start the tree, I always end with ___ because ___.</w:t>
+      </w:r>
+      <w:r>
+        <w:rPr>
+          <w:i/>
+          <w:iCs/>
+          <w:color w:val="5F6F80"/>
+          <w:sz w:val="19"/>
+          <w:szCs w:val="19"/>
+        </w:rPr>
+        <w:br/>
+        <w:t xml:space="preserve">
+No importa cómo empiece el árbol, siempre termino con ___ porque ___.</w:t>
+      </w:r>
+    </w:p>
+    <w:p>
+      <w:pPr>
+        <w:spacing w:after="60"/>
+      </w:pPr>
+      <w:r>
+        <w:rPr>
+          <w:sz w:val="21"/>
+          <w:szCs w:val="21"/>
+        </w:rPr>
+        <w:t xml:space="preserve">Prime numbers are like building blocks because ___.</w:t>
+      </w:r>
+      <w:r>
+        <w:rPr>
+          <w:i/>
+          <w:iCs/>
+          <w:color w:val="5F6F80"/>
+          <w:sz w:val="19"/>
+          <w:szCs w:val="19"/>
+        </w:rPr>
+        <w:br/>
+        <w:t xml:space="preserve">
+Los números primos son como bloques de construcción porque ___.</w:t>
+      </w:r>
+    </w:p>
+    <w:p>
+      <w:pPr>
+        <w:spacing w:after="60"/>
+      </w:pPr>
+      <w:r>
+        <w:rPr>
+          <w:b/>
+          <w:bCs/>
+          <w:color w:val="12355B"/>
+          <w:sz w:val="20"/>
+          <w:szCs w:val="20"/>
+        </w:rPr>
+        <w:t xml:space="preserve">Word bank: </w:t>
+      </w:r>
+      <w:r>
+        <w:rPr>
+          <w:color w:val="1FA6A2"/>
+          <w:sz w:val="20"/>
+          <w:szCs w:val="20"/>
+        </w:rPr>
+        <w:t xml:space="preserve">prime number, composite number, prime factorization, factor tree, product</w:t>
+      </w:r>
+    </w:p>
+    <w:p>
+      <w:pPr>
+        <w:spacing w:after="60"/>
+      </w:pPr>
+      <w:r>
+        <w:rPr>
+          <w:b/>
+          <w:bCs/>
+          <w:color w:val="12355B"/>
+          <w:sz w:val="19"/>
+          <w:szCs w:val="19"/>
+        </w:rPr>
+        <w:t xml:space="preserve">Listen for: </w:t>
+      </w:r>
+      <w:r>
+        <w:rPr>
+          <w:i/>
+          <w:iCs/>
+          <w:color w:val="5F6F80"/>
+          <w:sz w:val="19"/>
+          <w:szCs w:val="19"/>
+        </w:rPr>
+        <w:t xml:space="preserve">Students explain that breaking down different starting splits still reduces to the same prime factors, so the prime factorization is unique (the Fundamental Theorem of Arithmetic in plain words).</w:t>
+      </w:r>
+    </w:p>
+    <w:p>
+      <w:pPr>
+        <w:spacing w:after="60"/>
+      </w:pPr>
+      <w:r>
+        <w:rPr>
+          <w:b/>
+          <w:bCs/>
+          <w:color w:val="9A6B12"/>
+          <w:sz w:val="20"/>
+          <w:szCs w:val="20"/>
+        </w:rPr>
+        <w:t xml:space="preserve">Level 2: </w:t>
+      </w:r>
+      <w:r>
+        <w:rPr>
+          <w:sz w:val="20"/>
+          <w:szCs w:val="20"/>
+        </w:rPr>
+        <w:t xml:space="preserve">Start 48 two different ways (such as 6 × 8 and 4 × 12) and show both give 2⁴ × 3. Explain why this had to happen.</w:t>
+      </w:r>
+    </w:p>
+    <w:p>
+      <w:pPr>
+        <w:spacing w:after="60"/>
+        <w:ind w:left="360"/>
+      </w:pPr>
+      <w:r>
+        <w:rPr>
+          <w:sz w:val="20"/>
+          <w:szCs w:val="20"/>
+        </w:rPr>
+        <w:t xml:space="preserve">• Starting with 6 × 8 gives ___, and starting with 4 × 12 gives ___.</w:t>
+      </w:r>
+    </w:p>
+    <w:p>
+      <w:pPr>
+        <w:spacing w:after="60"/>
+        <w:ind w:left="360"/>
+      </w:pPr>
+      <w:r>
+        <w:rPr>
+          <w:sz w:val="20"/>
+          <w:szCs w:val="20"/>
+        </w:rPr>
+        <w:t xml:space="preserve">• Both match because ___.</w:t>
+      </w:r>
+    </w:p>
+    <w:p>
+      <w:pPr>
+        <w:pStyle w:val="Heading2"/>
+        <w:pBdr>
+          <w:left w:val="single" w:color="1FA6A2" w:sz="18" w:space="8"/>
+        </w:pBdr>
+        <w:spacing w:after="100" w:before="200"/>
+      </w:pPr>
+      <w:r>
+        <w:rPr>
+          <w:b/>
+          <w:bCs/>
           <w:color w:val="9A6B12"/>
           <w:sz w:val="26"/>
           <w:szCs w:val="26"/>
@@ -935,7 +1729,7 @@
           <w:sz w:val="21"/>
           <w:szCs w:val="21"/>
         </w:rPr>
-        <w:t xml:space="preserve">I know ___ because ___.</w:t>
+        <w:t xml:space="preserve">48 is a ___ number because it has ___.</w:t>
       </w:r>
       <w:r>
         <w:rPr>
@@ -947,19 +1741,19 @@
         </w:rPr>
         <w:br/>
         <w:t xml:space="preserve">
-Sé que ___ porque ___.</w:t>
-      </w:r>
-    </w:p>
-    <w:p>
-      <w:pPr>
-        <w:spacing w:after="60"/>
-      </w:pPr>
-      <w:r>
-        <w:rPr>
-          <w:sz w:val="21"/>
-          <w:szCs w:val="21"/>
-        </w:rPr>
-        <w:t xml:space="preserve">First I ___, then I ___.</w:t>
+48 es un número ___ porque tiene ___.</w:t>
+      </w:r>
+    </w:p>
+    <w:p>
+      <w:pPr>
+        <w:spacing w:after="60"/>
+      </w:pPr>
+      <w:r>
+        <w:rPr>
+          <w:sz w:val="21"/>
+          <w:szCs w:val="21"/>
+        </w:rPr>
+        <w:t xml:space="preserve">I can tell before factoring because ___.</w:t>
       </w:r>
       <w:r>
         <w:rPr>
@@ -971,19 +1765,19 @@
         </w:rPr>
         <w:br/>
         <w:t xml:space="preserve">
-Primero ___, luego ___.</w:t>
-      </w:r>
-    </w:p>
-    <w:p>
-      <w:pPr>
-        <w:spacing w:after="60"/>
-      </w:pPr>
-      <w:r>
-        <w:rPr>
-          <w:sz w:val="21"/>
-          <w:szCs w:val="21"/>
-        </w:rPr>
-        <w:t xml:space="preserve">This is important because ___.</w:t>
+Puedo saberlo antes de factorizar porque ___.</w:t>
+      </w:r>
+    </w:p>
+    <w:p>
+      <w:pPr>
+        <w:spacing w:after="60"/>
+      </w:pPr>
+      <w:r>
+        <w:rPr>
+          <w:sz w:val="21"/>
+          <w:szCs w:val="21"/>
+        </w:rPr>
+        <w:t xml:space="preserve">I broke 48 into ___ first because ___.</w:t>
       </w:r>
       <w:r>
         <w:rPr>
@@ -995,7 +1789,7 @@
         </w:rPr>
         <w:br/>
         <w:t xml:space="preserve">
-Esto es importante porque ___.</w:t>
+Separé 48 en ___ primero porque ___.</w:t>
       </w:r>
     </w:p>
     <w:p>

</xml_diff>

<commit_message>
Make guided notes more visual + add optional Turn & Talk hints and sentence starters
</commit_message>
<xml_diff>
--- a/lessons/1-1-flagship/downloads/1-1-flagship-notes.docx
+++ b/lessons/1-1-flagship/downloads/1-1-flagship-notes.docx
@@ -437,6 +437,43 @@
       </w:pPr>
       <w:r>
         <w:rPr>
+          <w:b/>
+          <w:bCs/>
+          <w:color w:val="1FA6A2"/>
+          <w:sz w:val="20"/>
+          <w:szCs w:val="20"/>
+        </w:rPr>
+        <w:t xml:space="preserve">Hint (optional): </w:t>
+      </w:r>
+      <w:r>
+        <w:rPr>
+          <w:sz w:val="20"/>
+          <w:szCs w:val="20"/>
+        </w:rPr>
+        <w:t xml:space="preserve">Try starting with the word "prime number" or "composite number". Re-read the question and underline what it is asking you to compare or find. Use one number or word from the problem as your evidence.</w:t>
+      </w:r>
+    </w:p>
+    <w:p>
+      <w:pPr>
+        <w:spacing w:after="60"/>
+      </w:pPr>
+      <w:r>
+        <w:rPr>
+          <w:b/>
+          <w:bCs/>
+          <w:color w:val="12355B"/>
+          <w:sz w:val="19"/>
+          <w:szCs w:val="19"/>
+        </w:rPr>
+        <w:t xml:space="preserve">Sentence starters (optional)</w:t>
+      </w:r>
+    </w:p>
+    <w:p>
+      <w:pPr>
+        <w:spacing w:after="60"/>
+      </w:pPr>
+      <w:r>
+        <w:rPr>
           <w:sz w:val="21"/>
           <w:szCs w:val="21"/>
         </w:rPr>
@@ -627,6 +664,43 @@
       </w:pPr>
       <w:r>
         <w:rPr>
+          <w:b/>
+          <w:bCs/>
+          <w:color w:val="1FA6A2"/>
+          <w:sz w:val="20"/>
+          <w:szCs w:val="20"/>
+        </w:rPr>
+        <w:t xml:space="preserve">Hint (optional): </w:t>
+      </w:r>
+      <w:r>
+        <w:rPr>
+          <w:sz w:val="20"/>
+          <w:szCs w:val="20"/>
+        </w:rPr>
+        <w:t xml:space="preserve">Try starting with the word "prime number" or "composite number". Re-read the question and underline what it is asking you to compare or find. Use one number or word from the problem as your evidence.</w:t>
+      </w:r>
+    </w:p>
+    <w:p>
+      <w:pPr>
+        <w:spacing w:after="60"/>
+      </w:pPr>
+      <w:r>
+        <w:rPr>
+          <w:b/>
+          <w:bCs/>
+          <w:color w:val="12355B"/>
+          <w:sz w:val="19"/>
+          <w:szCs w:val="19"/>
+        </w:rPr>
+        <w:t xml:space="preserve">Sentence starters (optional)</w:t>
+      </w:r>
+    </w:p>
+    <w:p>
+      <w:pPr>
+        <w:spacing w:after="60"/>
+      </w:pPr>
+      <w:r>
+        <w:rPr>
           <w:sz w:val="21"/>
           <w:szCs w:val="21"/>
         </w:rPr>
@@ -817,6 +891,43 @@
       </w:pPr>
       <w:r>
         <w:rPr>
+          <w:b/>
+          <w:bCs/>
+          <w:color w:val="1FA6A2"/>
+          <w:sz w:val="20"/>
+          <w:szCs w:val="20"/>
+        </w:rPr>
+        <w:t xml:space="preserve">Hint (optional): </w:t>
+      </w:r>
+      <w:r>
+        <w:rPr>
+          <w:sz w:val="20"/>
+          <w:szCs w:val="20"/>
+        </w:rPr>
+        <w:t xml:space="preserve">Try starting with the word "prime factorization" or "factor". Re-read the question and underline what it is asking you to compare or find. Use one number or word from the problem as your evidence.</w:t>
+      </w:r>
+    </w:p>
+    <w:p>
+      <w:pPr>
+        <w:spacing w:after="60"/>
+      </w:pPr>
+      <w:r>
+        <w:rPr>
+          <w:b/>
+          <w:bCs/>
+          <w:color w:val="12355B"/>
+          <w:sz w:val="19"/>
+          <w:szCs w:val="19"/>
+        </w:rPr>
+        <w:t xml:space="preserve">Sentence starters (optional)</w:t>
+      </w:r>
+    </w:p>
+    <w:p>
+      <w:pPr>
+        <w:spacing w:after="60"/>
+      </w:pPr>
+      <w:r>
+        <w:rPr>
           <w:sz w:val="21"/>
           <w:szCs w:val="21"/>
         </w:rPr>
@@ -999,6 +1110,43 @@
           <w:szCs w:val="20"/>
         </w:rPr>
         <w:t xml:space="preserve">Primes are unique building blocks, so the set of prime factors is always the same.</w:t>
+      </w:r>
+    </w:p>
+    <w:p>
+      <w:pPr>
+        <w:spacing w:after="60"/>
+      </w:pPr>
+      <w:r>
+        <w:rPr>
+          <w:b/>
+          <w:bCs/>
+          <w:color w:val="1FA6A2"/>
+          <w:sz w:val="20"/>
+          <w:szCs w:val="20"/>
+        </w:rPr>
+        <w:t xml:space="preserve">Hint (optional): </w:t>
+      </w:r>
+      <w:r>
+        <w:rPr>
+          <w:sz w:val="20"/>
+          <w:szCs w:val="20"/>
+        </w:rPr>
+        <w:t xml:space="preserve">Try starting with the word "prime number" or "composite number". Re-read the question and underline what it is asking you to compare or find. Use one number or word from the problem as your evidence.</w:t>
+      </w:r>
+    </w:p>
+    <w:p>
+      <w:pPr>
+        <w:spacing w:after="60"/>
+      </w:pPr>
+      <w:r>
+        <w:rPr>
+          <w:b/>
+          <w:bCs/>
+          <w:color w:val="12355B"/>
+          <w:sz w:val="19"/>
+          <w:szCs w:val="19"/>
+        </w:rPr>
+        <w:t xml:space="preserve">Sentence starters (optional)</w:t>
       </w:r>
     </w:p>
     <w:p>

</xml_diff>

<commit_message>
fix(docx): embed visual vocabulary as rasterized PNG images (resvg); drop caption-text dump that broke Word formatting
</commit_message>
<xml_diff>
--- a/lessons/1-1-flagship/downloads/1-1-flagship-notes.docx
+++ b/lessons/1-1-flagship/downloads/1-1-flagship-notes.docx
@@ -97,6 +97,69 @@
       </w:pPr>
       <w:r>
         <w:rPr>
+          <w:i/>
+          <w:iCs/>
+          <w:color w:val="5F6F80"/>
+          <w:sz w:val="19"/>
+          <w:szCs w:val="19"/>
+        </w:rPr>
+        <w:t xml:space="preserve">Picture first, then the word, then a plain-language meaning.</w:t>
+      </w:r>
+    </w:p>
+    <w:p>
+      <w:pPr>
+        <w:keepNext/>
+        <w:spacing w:after="20" w:before="120"/>
+        <w:jc w:val="center"/>
+      </w:pPr>
+      <w:r>
+        <w:drawing>
+          <wp:inline distT="0" distB="0" distL="0" distR="0">
+            <wp:extent cx="1238250" cy="933450"/>
+            <wp:effectExtent t="0" r="0" b="0" l="0"/>
+            <wp:docPr id="1" name="" descr="" title=""/>
+            <wp:cNvGraphicFramePr>
+              <a:graphicFrameLocks xmlns:a="http://schemas.openxmlformats.org/drawingml/2006/main" noChangeAspect="1"/>
+            </wp:cNvGraphicFramePr>
+            <a:graphic xmlns:a="http://schemas.openxmlformats.org/drawingml/2006/main">
+              <a:graphicData uri="http://schemas.openxmlformats.org/drawingml/2006/picture">
+                <pic:pic xmlns:pic="http://schemas.openxmlformats.org/drawingml/2006/picture">
+                  <pic:nvPicPr>
+                    <pic:cNvPr id="0" name="" descr=""/>
+                    <pic:cNvPicPr>
+                      <a:picLocks noChangeAspect="1" noChangeArrowheads="1"/>
+                    </pic:cNvPicPr>
+                  </pic:nvPicPr>
+                  <pic:blipFill>
+                    <a:blip r:embed="rId9" cstate="none"/>
+                    <a:srcRect/>
+                    <a:stretch>
+                      <a:fillRect/>
+                    </a:stretch>
+                  </pic:blipFill>
+                  <pic:spPr bwMode="auto">
+                    <a:xfrm>
+                      <a:off x="0" y="0"/>
+                      <a:ext cx="1238250" cy="933450"/>
+                    </a:xfrm>
+                    <a:prstGeom prst="rect">
+                      <a:avLst/>
+                    </a:prstGeom>
+                  </pic:spPr>
+                </pic:pic>
+              </a:graphicData>
+            </a:graphic>
+          </wp:inline>
+        </w:drawing>
+      </w:r>
+    </w:p>
+    <w:p>
+      <w:pPr>
+        <w:keepNext/>
+        <w:spacing w:after="20"/>
+      </w:pPr>
+      <w:r>
+        <w:rPr>
           <w:b/>
           <w:bCs/>
           <w:color w:val="12355B"/>
@@ -118,7 +181,7 @@
     </w:p>
     <w:p>
       <w:pPr>
-        <w:spacing w:after="60"/>
+        <w:spacing w:after="160"/>
       </w:pPr>
       <w:r>
         <w:rPr>
@@ -130,22 +193,55 @@
     </w:p>
     <w:p>
       <w:pPr>
-        <w:spacing w:after="60"/>
-      </w:pPr>
-      <w:r>
-        <w:rPr>
-          <w:i/>
-          <w:iCs/>
-          <w:color w:val="5F6F80"/>
-          <w:sz w:val="19"/>
-          <w:szCs w:val="19"/>
-        </w:rPr>
-        <w:t xml:space="preserve">7 has only two factors: 1 × 7. So 7 is prime.</w:t>
-      </w:r>
-    </w:p>
-    <w:p>
-      <w:pPr>
-        <w:spacing w:after="60"/>
+        <w:keepNext/>
+        <w:spacing w:after="20" w:before="120"/>
+        <w:jc w:val="center"/>
+      </w:pPr>
+      <w:r>
+        <w:drawing>
+          <wp:inline distT="0" distB="0" distL="0" distR="0">
+            <wp:extent cx="1238250" cy="933450"/>
+            <wp:effectExtent t="0" r="0" b="0" l="0"/>
+            <wp:docPr id="1" name="" descr="" title=""/>
+            <wp:cNvGraphicFramePr>
+              <a:graphicFrameLocks xmlns:a="http://schemas.openxmlformats.org/drawingml/2006/main" noChangeAspect="1"/>
+            </wp:cNvGraphicFramePr>
+            <a:graphic xmlns:a="http://schemas.openxmlformats.org/drawingml/2006/main">
+              <a:graphicData uri="http://schemas.openxmlformats.org/drawingml/2006/picture">
+                <pic:pic xmlns:pic="http://schemas.openxmlformats.org/drawingml/2006/picture">
+                  <pic:nvPicPr>
+                    <pic:cNvPr id="0" name="" descr=""/>
+                    <pic:cNvPicPr>
+                      <a:picLocks noChangeAspect="1" noChangeArrowheads="1"/>
+                    </pic:cNvPicPr>
+                  </pic:nvPicPr>
+                  <pic:blipFill>
+                    <a:blip r:embed="rId10" cstate="none"/>
+                    <a:srcRect/>
+                    <a:stretch>
+                      <a:fillRect/>
+                    </a:stretch>
+                  </pic:blipFill>
+                  <pic:spPr bwMode="auto">
+                    <a:xfrm>
+                      <a:off x="0" y="0"/>
+                      <a:ext cx="1238250" cy="933450"/>
+                    </a:xfrm>
+                    <a:prstGeom prst="rect">
+                      <a:avLst/>
+                    </a:prstGeom>
+                  </pic:spPr>
+                </pic:pic>
+              </a:graphicData>
+            </a:graphic>
+          </wp:inline>
+        </w:drawing>
+      </w:r>
+    </w:p>
+    <w:p>
+      <w:pPr>
+        <w:keepNext/>
+        <w:spacing w:after="20"/>
       </w:pPr>
       <w:r>
         <w:rPr>
@@ -170,7 +266,7 @@
     </w:p>
     <w:p>
       <w:pPr>
-        <w:spacing w:after="60"/>
+        <w:spacing w:after="160"/>
       </w:pPr>
       <w:r>
         <w:rPr>
@@ -182,22 +278,55 @@
     </w:p>
     <w:p>
       <w:pPr>
-        <w:spacing w:after="60"/>
-      </w:pPr>
-      <w:r>
-        <w:rPr>
-          <w:i/>
-          <w:iCs/>
-          <w:color w:val="5F6F80"/>
-          <w:sz w:val="19"/>
-          <w:szCs w:val="19"/>
-        </w:rPr>
-        <w:t xml:space="preserve">12 = 1 × 12, 2 × 6, 3 × 4 — six factors, so 12 is composite</w:t>
-      </w:r>
-    </w:p>
-    <w:p>
-      <w:pPr>
-        <w:spacing w:after="60"/>
+        <w:keepNext/>
+        <w:spacing w:after="20" w:before="120"/>
+        <w:jc w:val="center"/>
+      </w:pPr>
+      <w:r>
+        <w:drawing>
+          <wp:inline distT="0" distB="0" distL="0" distR="0">
+            <wp:extent cx="1238250" cy="933450"/>
+            <wp:effectExtent t="0" r="0" b="0" l="0"/>
+            <wp:docPr id="1" name="" descr="" title=""/>
+            <wp:cNvGraphicFramePr>
+              <a:graphicFrameLocks xmlns:a="http://schemas.openxmlformats.org/drawingml/2006/main" noChangeAspect="1"/>
+            </wp:cNvGraphicFramePr>
+            <a:graphic xmlns:a="http://schemas.openxmlformats.org/drawingml/2006/main">
+              <a:graphicData uri="http://schemas.openxmlformats.org/drawingml/2006/picture">
+                <pic:pic xmlns:pic="http://schemas.openxmlformats.org/drawingml/2006/picture">
+                  <pic:nvPicPr>
+                    <pic:cNvPr id="0" name="" descr=""/>
+                    <pic:cNvPicPr>
+                      <a:picLocks noChangeAspect="1" noChangeArrowheads="1"/>
+                    </pic:cNvPicPr>
+                  </pic:nvPicPr>
+                  <pic:blipFill>
+                    <a:blip r:embed="rId10" cstate="none"/>
+                    <a:srcRect/>
+                    <a:stretch>
+                      <a:fillRect/>
+                    </a:stretch>
+                  </pic:blipFill>
+                  <pic:spPr bwMode="auto">
+                    <a:xfrm>
+                      <a:off x="0" y="0"/>
+                      <a:ext cx="1238250" cy="933450"/>
+                    </a:xfrm>
+                    <a:prstGeom prst="rect">
+                      <a:avLst/>
+                    </a:prstGeom>
+                  </pic:spPr>
+                </pic:pic>
+              </a:graphicData>
+            </a:graphic>
+          </wp:inline>
+        </w:drawing>
+      </w:r>
+    </w:p>
+    <w:p>
+      <w:pPr>
+        <w:keepNext/>
+        <w:spacing w:after="20"/>
       </w:pPr>
       <w:r>
         <w:rPr>
@@ -222,7 +351,7 @@
     </w:p>
     <w:p>
       <w:pPr>
-        <w:spacing w:after="60"/>
+        <w:spacing w:after="160"/>
       </w:pPr>
       <w:r>
         <w:rPr>
@@ -234,22 +363,55 @@
     </w:p>
     <w:p>
       <w:pPr>
-        <w:spacing w:after="60"/>
-      </w:pPr>
-      <w:r>
-        <w:rPr>
-          <w:i/>
-          <w:iCs/>
-          <w:color w:val="5F6F80"/>
-          <w:sz w:val="19"/>
-          <w:szCs w:val="19"/>
-        </w:rPr>
-        <w:t xml:space="preserve">36 = 2 × 2 × 3 × 3 = 2² × 3²</w:t>
-      </w:r>
-    </w:p>
-    <w:p>
-      <w:pPr>
-        <w:spacing w:after="60"/>
+        <w:keepNext/>
+        <w:spacing w:after="20" w:before="120"/>
+        <w:jc w:val="center"/>
+      </w:pPr>
+      <w:r>
+        <w:drawing>
+          <wp:inline distT="0" distB="0" distL="0" distR="0">
+            <wp:extent cx="1238250" cy="933450"/>
+            <wp:effectExtent t="0" r="0" b="0" l="0"/>
+            <wp:docPr id="1" name="" descr="" title=""/>
+            <wp:cNvGraphicFramePr>
+              <a:graphicFrameLocks xmlns:a="http://schemas.openxmlformats.org/drawingml/2006/main" noChangeAspect="1"/>
+            </wp:cNvGraphicFramePr>
+            <a:graphic xmlns:a="http://schemas.openxmlformats.org/drawingml/2006/main">
+              <a:graphicData uri="http://schemas.openxmlformats.org/drawingml/2006/picture">
+                <pic:pic xmlns:pic="http://schemas.openxmlformats.org/drawingml/2006/picture">
+                  <pic:nvPicPr>
+                    <pic:cNvPr id="0" name="" descr=""/>
+                    <pic:cNvPicPr>
+                      <a:picLocks noChangeAspect="1" noChangeArrowheads="1"/>
+                    </pic:cNvPicPr>
+                  </pic:nvPicPr>
+                  <pic:blipFill>
+                    <a:blip r:embed="rId10" cstate="none"/>
+                    <a:srcRect/>
+                    <a:stretch>
+                      <a:fillRect/>
+                    </a:stretch>
+                  </pic:blipFill>
+                  <pic:spPr bwMode="auto">
+                    <a:xfrm>
+                      <a:off x="0" y="0"/>
+                      <a:ext cx="1238250" cy="933450"/>
+                    </a:xfrm>
+                    <a:prstGeom prst="rect">
+                      <a:avLst/>
+                    </a:prstGeom>
+                  </pic:spPr>
+                </pic:pic>
+              </a:graphicData>
+            </a:graphic>
+          </wp:inline>
+        </w:drawing>
+      </w:r>
+    </w:p>
+    <w:p>
+      <w:pPr>
+        <w:keepNext/>
+        <w:spacing w:after="20"/>
       </w:pPr>
       <w:r>
         <w:rPr>
@@ -274,7 +436,7 @@
     </w:p>
     <w:p>
       <w:pPr>
-        <w:spacing w:after="60"/>
+        <w:spacing w:after="160"/>
       </w:pPr>
       <w:r>
         <w:rPr>
@@ -286,22 +448,55 @@
     </w:p>
     <w:p>
       <w:pPr>
-        <w:spacing w:after="60"/>
-      </w:pPr>
-      <w:r>
-        <w:rPr>
-          <w:i/>
-          <w:iCs/>
-          <w:color w:val="5F6F80"/>
-          <w:sz w:val="19"/>
-          <w:szCs w:val="19"/>
-        </w:rPr>
-        <w:t xml:space="preserve">24 → 4 × 6 → (2 × 2) × (2 × 3) → 2 × 2 × 2 × 3</w:t>
-      </w:r>
-    </w:p>
-    <w:p>
-      <w:pPr>
-        <w:spacing w:after="60"/>
+        <w:keepNext/>
+        <w:spacing w:after="20" w:before="120"/>
+        <w:jc w:val="center"/>
+      </w:pPr>
+      <w:r>
+        <w:drawing>
+          <wp:inline distT="0" distB="0" distL="0" distR="0">
+            <wp:extent cx="1238250" cy="933450"/>
+            <wp:effectExtent t="0" r="0" b="0" l="0"/>
+            <wp:docPr id="1" name="" descr="" title=""/>
+            <wp:cNvGraphicFramePr>
+              <a:graphicFrameLocks xmlns:a="http://schemas.openxmlformats.org/drawingml/2006/main" noChangeAspect="1"/>
+            </wp:cNvGraphicFramePr>
+            <a:graphic xmlns:a="http://schemas.openxmlformats.org/drawingml/2006/main">
+              <a:graphicData uri="http://schemas.openxmlformats.org/drawingml/2006/picture">
+                <pic:pic xmlns:pic="http://schemas.openxmlformats.org/drawingml/2006/picture">
+                  <pic:nvPicPr>
+                    <pic:cNvPr id="0" name="" descr=""/>
+                    <pic:cNvPicPr>
+                      <a:picLocks noChangeAspect="1" noChangeArrowheads="1"/>
+                    </pic:cNvPicPr>
+                  </pic:nvPicPr>
+                  <pic:blipFill>
+                    <a:blip r:embed="rId11" cstate="none"/>
+                    <a:srcRect/>
+                    <a:stretch>
+                      <a:fillRect/>
+                    </a:stretch>
+                  </pic:blipFill>
+                  <pic:spPr bwMode="auto">
+                    <a:xfrm>
+                      <a:off x="0" y="0"/>
+                      <a:ext cx="1238250" cy="933450"/>
+                    </a:xfrm>
+                    <a:prstGeom prst="rect">
+                      <a:avLst/>
+                    </a:prstGeom>
+                  </pic:spPr>
+                </pic:pic>
+              </a:graphicData>
+            </a:graphic>
+          </wp:inline>
+        </w:drawing>
+      </w:r>
+    </w:p>
+    <w:p>
+      <w:pPr>
+        <w:keepNext/>
+        <w:spacing w:after="20"/>
       </w:pPr>
       <w:r>
         <w:rPr>
@@ -326,7 +521,7 @@
     </w:p>
     <w:p>
       <w:pPr>
-        <w:spacing w:after="60"/>
+        <w:spacing w:after="160"/>
       </w:pPr>
       <w:r>
         <w:rPr>
@@ -334,21 +529,6 @@
           <w:szCs w:val="21"/>
         </w:rPr>
         <w:t xml:space="preserve">A small number that tells how many times to multiply a number by itself.</w:t>
-      </w:r>
-    </w:p>
-    <w:p>
-      <w:pPr>
-        <w:spacing w:after="60"/>
-      </w:pPr>
-      <w:r>
-        <w:rPr>
-          <w:i/>
-          <w:iCs/>
-          <w:color w:val="5F6F80"/>
-          <w:sz w:val="19"/>
-          <w:szCs w:val="19"/>
-        </w:rPr>
-        <w:t xml:space="preserve">2³ means 2 × 2 × 2 = 8</w:t>
       </w:r>
     </w:p>
     <w:p>

</xml_diff>

<commit_message>
Add worked-along guided-notes steps (I Do/We Do/You Do) to all 74 lessons
Embed real practice problems with simple labeled steps inside the guided
notes so students see the notes in action before the end practice.

- New engine/core/worked-steps.js: shared derivation of the I Do/We Do/You Do
  worked frame from each lesson's real practice items (no invented math).
  Imported by both generators so HTML/PDF and DOCX render identically.
- generate-notes.mjs: replace blank Watch/We try/You try frame with a solved
  I-Do example (numbered steps + answer), blank-step We-Do, and You-Do problem;
  remove redundant Guided Examples; include optional items in practice pool;
  add We Do/You Do answers to the key; print CSS for new blocks.
- generate-docx.mjs: solved I-Do example, blank-step We-Do, exclude worked
  problems from independent practice, add worked answers to the key.
- Regenerate all 74 notes.html, .docx, and .pdf packets.
</commit_message>
<xml_diff>
--- a/lessons/1-1-flagship/downloads/1-1-flagship-notes.docx
+++ b/lessons/1-1-flagship/downloads/1-1-flagship-notes.docx
@@ -1210,7 +1210,7 @@
           <w:sz w:val="24"/>
           <w:szCs w:val="24"/>
         </w:rPr>
-        <w:t xml:space="preserve">Try the Model</w:t>
+        <w:t xml:space="preserve">Solved Example</w:t>
       </w:r>
       <w:r>
         <w:rPr>
@@ -1220,90 +1220,152 @@
           <w:sz w:val="19"/>
           <w:szCs w:val="19"/>
         </w:rPr>
-        <w:t xml:space="preserve">   step through it together</w:t>
-      </w:r>
-    </w:p>
-    <w:p>
-      <w:pPr>
-        <w:spacing w:after="80"/>
-      </w:pPr>
-      <w:r>
-        <w:rPr>
-          <w:sz w:val="21"/>
-          <w:szCs w:val="21"/>
-        </w:rPr>
-        <w:t xml:space="preserve">Sort these numbers — which are prime and which are composite?</w:t>
-      </w:r>
-    </w:p>
-    <w:p>
-      <w:pPr>
+        <w:t xml:space="preserve">   I Do — watch each step</w:t>
+      </w:r>
+    </w:p>
+    <w:p>
+      <w:pPr>
+        <w:keepNext/>
         <w:spacing w:after="40"/>
       </w:pPr>
       <w:r>
-        <w:t xml:space="preserve"/>
-      </w:r>
-    </w:p>
-    <w:tbl>
-      <w:tblPr>
-        <w:tblW w:type="pct" w:w="100%"/>
-        <w:tblBorders>
-          <w:top w:val="single" w:color="C7D2DD" w:sz="6"/>
-          <w:left w:val="single" w:color="C7D2DD" w:sz="6"/>
-          <w:bottom w:val="single" w:color="C7D2DD" w:sz="6"/>
-          <w:right w:val="single" w:color="C7D2DD" w:sz="6"/>
-          <w:insideH w:val="single" w:color="auto" w:sz="4"/>
-          <w:insideV w:val="single" w:color="auto" w:sz="4"/>
-        </w:tblBorders>
-      </w:tblPr>
-      <w:tblGrid>
-        <w:gridCol w:w="100"/>
-      </w:tblGrid>
-      <w:tr>
-        <w:tc>
-          <w:tcPr>
-            <w:shd w:fill="E6F4F3" w:color="auto" w:val="clear"/>
-            <w:tcMar>
-              <w:top w:type="dxa" w:w="60"/>
-              <w:left w:type="dxa" w:w="120"/>
-              <w:bottom w:type="dxa" w:w="60"/>
-              <w:right w:type="dxa" w:w="120"/>
-            </w:tcMar>
-          </w:tcPr>
-          <w:p>
-            <w:pPr>
-              <w:spacing w:after="0" w:line="320"/>
-            </w:pPr>
-            <w:r>
-              <w:t xml:space="preserve"/>
-            </w:r>
-          </w:p>
-          <w:p>
-            <w:pPr>
-              <w:spacing w:after="0" w:line="320"/>
-            </w:pPr>
-            <w:r>
-              <w:t xml:space="preserve"/>
-            </w:r>
-          </w:p>
-          <w:p>
-            <w:pPr>
-              <w:spacing w:after="0" w:line="320"/>
-            </w:pPr>
-            <w:r>
-              <w:t xml:space="preserve"/>
-            </w:r>
-          </w:p>
-          <w:p>
-            <w:pPr>
-              <w:spacing w:after="0" w:line="320"/>
-            </w:pPr>
-            <w:r>
-              <w:t xml:space="preserve"/>
-            </w:r>
-          </w:p>
-        </w:tc>
-      </w:tr>
-    </w:tbl>
+        <w:rPr>
+          <w:b/>
+          <w:bCs/>
+          <w:color w:val="12355B"/>
+          <w:sz w:val="21"/>
+          <w:szCs w:val="21"/>
+        </w:rPr>
+        <w:t xml:space="preserve">Problem:  </w:t>
+      </w:r>
+      <w:r>
+        <w:rPr>
+          <w:sz w:val="21"/>
+          <w:szCs w:val="21"/>
+        </w:rPr>
+        <w:t xml:space="preserve">Which of the following is a prime number?</w:t>
+      </w:r>
+    </w:p>
+    <w:p>
+      <w:pPr>
+        <w:spacing w:after="30"/>
+        <w:ind w:left="420"/>
+      </w:pPr>
+      <w:r>
+        <w:rPr>
+          <w:sz w:val="20"/>
+          <w:szCs w:val="20"/>
+        </w:rPr>
+        <w:t xml:space="preserve">A)  17</w:t>
+      </w:r>
+    </w:p>
+    <w:p>
+      <w:pPr>
+        <w:spacing w:after="30"/>
+        <w:ind w:left="420"/>
+      </w:pPr>
+      <w:r>
+        <w:rPr>
+          <w:sz w:val="20"/>
+          <w:szCs w:val="20"/>
+        </w:rPr>
+        <w:t xml:space="preserve">B)  15</w:t>
+      </w:r>
+    </w:p>
+    <w:p>
+      <w:pPr>
+        <w:spacing w:after="30"/>
+        <w:ind w:left="420"/>
+      </w:pPr>
+      <w:r>
+        <w:rPr>
+          <w:sz w:val="20"/>
+          <w:szCs w:val="20"/>
+        </w:rPr>
+        <w:t xml:space="preserve">C)  21</w:t>
+      </w:r>
+    </w:p>
+    <w:p>
+      <w:pPr>
+        <w:spacing w:after="30"/>
+        <w:ind w:left="420"/>
+      </w:pPr>
+      <w:r>
+        <w:rPr>
+          <w:sz w:val="20"/>
+          <w:szCs w:val="20"/>
+        </w:rPr>
+        <w:t xml:space="preserve">D)  9</w:t>
+      </w:r>
+    </w:p>
+    <w:p>
+      <w:pPr>
+        <w:spacing w:after="20" w:before="50"/>
+      </w:pPr>
+      <w:r>
+        <w:rPr>
+          <w:b/>
+          <w:bCs/>
+          <w:color w:val="1FA6A2"/>
+          <w:sz w:val="21"/>
+          <w:szCs w:val="21"/>
+        </w:rPr>
+        <w:t xml:space="preserve">Step 1:  </w:t>
+      </w:r>
+      <w:r>
+        <w:rPr>
+          <w:sz w:val="21"/>
+          <w:szCs w:val="21"/>
+        </w:rPr>
+        <w:t xml:space="preserve">17 has exactly two factors: 1 and 17.</w:t>
+      </w:r>
+    </w:p>
+    <w:p>
+      <w:pPr>
+        <w:spacing w:after="20" w:before="50"/>
+      </w:pPr>
+      <w:r>
+        <w:rPr>
+          <w:b/>
+          <w:bCs/>
+          <w:color w:val="1FA6A2"/>
+          <w:sz w:val="21"/>
+          <w:szCs w:val="21"/>
+        </w:rPr>
+        <w:t xml:space="preserve">Step 2:  </w:t>
+      </w:r>
+      <w:r>
+        <w:rPr>
+          <w:sz w:val="21"/>
+          <w:szCs w:val="21"/>
+        </w:rPr>
+        <w:t xml:space="preserve">15 = 3 × 5, 21 = 3 × 7, and 9 = 3 × 3, so they are all composite.</w:t>
+      </w:r>
+    </w:p>
+    <w:p>
+      <w:pPr>
+        <w:spacing w:after="40" w:before="60"/>
+      </w:pPr>
+      <w:r>
+        <w:rPr>
+          <w:b/>
+          <w:bCs/>
+          <w:color w:val="12355B"/>
+          <w:sz w:val="21"/>
+          <w:szCs w:val="21"/>
+        </w:rPr>
+        <w:t xml:space="preserve">Answer:  </w:t>
+      </w:r>
+      <w:r>
+        <w:rPr>
+          <w:b/>
+          <w:bCs/>
+          <w:sz w:val="21"/>
+          <w:szCs w:val="21"/>
+        </w:rPr>
+        <w:t xml:space="preserve">A. 17</w:t>
+      </w:r>
+    </w:p>
     <w:p>
       <w:pPr>
         <w:pStyle w:val="Heading1"/>
@@ -1348,6 +1410,170 @@
           <w:szCs w:val="19"/>
         </w:rPr>
         <w:t xml:space="preserve">   We Do — work with your class</w:t>
+      </w:r>
+    </w:p>
+    <w:p>
+      <w:pPr>
+        <w:keepNext/>
+        <w:spacing w:after="40" w:before="40"/>
+      </w:pPr>
+      <w:r>
+        <w:rPr>
+          <w:b/>
+          <w:bCs/>
+          <w:color w:val="12355B"/>
+          <w:sz w:val="21"/>
+          <w:szCs w:val="21"/>
+        </w:rPr>
+        <w:t xml:space="preserve">Problem:  </w:t>
+      </w:r>
+      <w:r>
+        <w:rPr>
+          <w:sz w:val="21"/>
+          <w:szCs w:val="21"/>
+        </w:rPr>
+        <w:t xml:space="preserve">What is the prime factorization of 30?</w:t>
+      </w:r>
+    </w:p>
+    <w:p>
+      <w:pPr>
+        <w:spacing w:after="30"/>
+        <w:ind w:left="420"/>
+      </w:pPr>
+      <w:r>
+        <w:rPr>
+          <w:sz w:val="20"/>
+          <w:szCs w:val="20"/>
+        </w:rPr>
+        <w:t xml:space="preserve">A)  2 × 3 × 5</w:t>
+      </w:r>
+    </w:p>
+    <w:p>
+      <w:pPr>
+        <w:spacing w:after="30"/>
+        <w:ind w:left="420"/>
+      </w:pPr>
+      <w:r>
+        <w:rPr>
+          <w:sz w:val="20"/>
+          <w:szCs w:val="20"/>
+        </w:rPr>
+        <w:t xml:space="preserve">B)  5 × 6</w:t>
+      </w:r>
+    </w:p>
+    <w:p>
+      <w:pPr>
+        <w:spacing w:after="30"/>
+        <w:ind w:left="420"/>
+      </w:pPr>
+      <w:r>
+        <w:rPr>
+          <w:sz w:val="20"/>
+          <w:szCs w:val="20"/>
+        </w:rPr>
+        <w:t xml:space="preserve">C)  2 × 15</w:t>
+      </w:r>
+    </w:p>
+    <w:p>
+      <w:pPr>
+        <w:spacing w:after="30"/>
+        <w:ind w:left="420"/>
+      </w:pPr>
+      <w:r>
+        <w:rPr>
+          <w:sz w:val="20"/>
+          <w:szCs w:val="20"/>
+        </w:rPr>
+        <w:t xml:space="preserve">D)  3 × 10</w:t>
+      </w:r>
+    </w:p>
+    <w:p>
+      <w:pPr>
+        <w:keepNext/>
+        <w:spacing w:after="0" w:before="50"/>
+      </w:pPr>
+      <w:r>
+        <w:rPr>
+          <w:b/>
+          <w:bCs/>
+          <w:color w:val="6B4FA0"/>
+          <w:sz w:val="21"/>
+          <w:szCs w:val="21"/>
+        </w:rPr>
+        <w:t xml:space="preserve">Step 1:</w:t>
+      </w:r>
+    </w:p>
+    <w:p>
+      <w:pPr>
+        <w:pBdr>
+          <w:bottom w:val="single" w:color="AFBECC" w:sz="6"/>
+        </w:pBdr>
+        <w:spacing w:after="30" w:before="150"/>
+      </w:pPr>
+      <w:r>
+        <w:t xml:space="preserve"/>
+      </w:r>
+    </w:p>
+    <w:p>
+      <w:pPr>
+        <w:keepNext/>
+        <w:spacing w:after="0" w:before="50"/>
+      </w:pPr>
+      <w:r>
+        <w:rPr>
+          <w:b/>
+          <w:bCs/>
+          <w:color w:val="6B4FA0"/>
+          <w:sz w:val="21"/>
+          <w:szCs w:val="21"/>
+        </w:rPr>
+        <w:t xml:space="preserve">Step 2:</w:t>
+      </w:r>
+    </w:p>
+    <w:p>
+      <w:pPr>
+        <w:pBdr>
+          <w:bottom w:val="single" w:color="AFBECC" w:sz="6"/>
+        </w:pBdr>
+        <w:spacing w:after="30" w:before="150"/>
+      </w:pPr>
+      <w:r>
+        <w:t xml:space="preserve"/>
+      </w:r>
+    </w:p>
+    <w:p>
+      <w:pPr>
+        <w:keepNext/>
+        <w:spacing w:after="0" w:before="60"/>
+      </w:pPr>
+      <w:r>
+        <w:rPr>
+          <w:b/>
+          <w:bCs/>
+          <w:color w:val="12355B"/>
+          <w:sz w:val="21"/>
+          <w:szCs w:val="21"/>
+        </w:rPr>
+        <w:t xml:space="preserve">Answer:</w:t>
+      </w:r>
+    </w:p>
+    <w:p>
+      <w:pPr>
+        <w:pBdr>
+          <w:bottom w:val="single" w:color="AFBECC" w:sz="6"/>
+        </w:pBdr>
+        <w:spacing w:after="30" w:before="150"/>
+      </w:pPr>
+      <w:r>
+        <w:t xml:space="preserve"/>
+      </w:r>
+    </w:p>
+    <w:p>
+      <w:pPr>
+        <w:spacing w:after="80"/>
+      </w:pPr>
+      <w:r>
+        <w:t xml:space="preserve"/>
       </w:r>
     </w:p>
     <w:tbl>
@@ -1948,7 +2174,7 @@
           <w:sz w:val="21"/>
           <w:szCs w:val="21"/>
         </w:rPr>
-        <w:t xml:space="preserve">Which of the following is a prime number?</w:t>
+        <w:t xml:space="preserve">What is the prime factorization of 18?</w:t>
       </w:r>
     </w:p>
     <w:p>
@@ -1961,7 +2187,7 @@
           <w:sz w:val="20"/>
           <w:szCs w:val="20"/>
         </w:rPr>
-        <w:t xml:space="preserve">A)  17</w:t>
+        <w:t xml:space="preserve">A)  2 × 3 × 3</w:t>
       </w:r>
     </w:p>
     <w:p>
@@ -1974,7 +2200,7 @@
           <w:sz w:val="20"/>
           <w:szCs w:val="20"/>
         </w:rPr>
-        <w:t xml:space="preserve">B)  15</w:t>
+        <w:t xml:space="preserve">B)  2 × 9</w:t>
       </w:r>
     </w:p>
     <w:p>
@@ -1987,7 +2213,7 @@
           <w:sz w:val="20"/>
           <w:szCs w:val="20"/>
         </w:rPr>
-        <w:t xml:space="preserve">C)  21</w:t>
+        <w:t xml:space="preserve">C)  3 × 6</w:t>
       </w:r>
     </w:p>
     <w:p>
@@ -2000,7 +2226,7 @@
           <w:sz w:val="20"/>
           <w:szCs w:val="20"/>
         </w:rPr>
-        <w:t xml:space="preserve">D)  9</w:t>
+        <w:t xml:space="preserve">D)  6 × 3</w:t>
       </w:r>
     </w:p>
     <w:p>
@@ -2078,7 +2304,7 @@
           <w:sz w:val="21"/>
           <w:szCs w:val="21"/>
         </w:rPr>
-        <w:t xml:space="preserve">What is the prime factorization of 30?</w:t>
+        <w:t xml:space="preserve">Which of these numbers is composite?</w:t>
       </w:r>
     </w:p>
     <w:p>
@@ -2091,7 +2317,7 @@
           <w:sz w:val="20"/>
           <w:szCs w:val="20"/>
         </w:rPr>
-        <w:t xml:space="preserve">A)  2 × 3 × 5</w:t>
+        <w:t xml:space="preserve">A)  27</w:t>
       </w:r>
     </w:p>
     <w:p>
@@ -2104,7 +2330,7 @@
           <w:sz w:val="20"/>
           <w:szCs w:val="20"/>
         </w:rPr>
-        <w:t xml:space="preserve">B)  5 × 6</w:t>
+        <w:t xml:space="preserve">B)  23</w:t>
       </w:r>
     </w:p>
     <w:p>
@@ -2117,7 +2343,7 @@
           <w:sz w:val="20"/>
           <w:szCs w:val="20"/>
         </w:rPr>
-        <w:t xml:space="preserve">C)  2 × 15</w:t>
+        <w:t xml:space="preserve">C)  29</w:t>
       </w:r>
     </w:p>
     <w:p>
@@ -2130,7 +2356,7 @@
           <w:sz w:val="20"/>
           <w:szCs w:val="20"/>
         </w:rPr>
-        <w:t xml:space="preserve">D)  3 × 10</w:t>
+        <w:t xml:space="preserve">D)  31</w:t>
       </w:r>
     </w:p>
     <w:p>
@@ -2208,7 +2434,7 @@
           <w:sz w:val="21"/>
           <w:szCs w:val="21"/>
         </w:rPr>
-        <w:t xml:space="preserve">What is the prime factorization of 18?</w:t>
+        <w:t xml:space="preserve">Two students found different factor trees for 60. Student A started with 2 × 30. Student B started with 6 × 10. Which statement is true?</w:t>
       </w:r>
     </w:p>
     <w:p>
@@ -2221,7 +2447,7 @@
           <w:sz w:val="20"/>
           <w:szCs w:val="20"/>
         </w:rPr>
-        <w:t xml:space="preserve">A)  2 × 3 × 3</w:t>
+        <w:t xml:space="preserve">A)  Both get the same prime factorization: 2 × 2 × 3 × 5</w:t>
       </w:r>
     </w:p>
     <w:p>
@@ -2234,7 +2460,7 @@
           <w:sz w:val="20"/>
           <w:szCs w:val="20"/>
         </w:rPr>
-        <w:t xml:space="preserve">B)  2 × 9</w:t>
+        <w:t xml:space="preserve">B)  Only Student A gets the correct prime factorization</w:t>
       </w:r>
     </w:p>
     <w:p>
@@ -2247,7 +2473,7 @@
           <w:sz w:val="20"/>
           <w:szCs w:val="20"/>
         </w:rPr>
-        <w:t xml:space="preserve">C)  3 × 6</w:t>
+        <w:t xml:space="preserve">C)  Only Student B gets the correct prime factorization</w:t>
       </w:r>
     </w:p>
     <w:p>
@@ -2260,7 +2486,7 @@
           <w:sz w:val="20"/>
           <w:szCs w:val="20"/>
         </w:rPr>
-        <w:t xml:space="preserve">D)  6 × 3</w:t>
+        <w:t xml:space="preserve">D)  They will get different prime factorizations</w:t>
       </w:r>
     </w:p>
     <w:p>
@@ -2318,136 +2544,6 @@
     </w:tbl>
     <w:p>
       <w:pPr>
-        <w:keepNext/>
-        <w:spacing w:after="60" w:before="160"/>
-      </w:pPr>
-      <w:r>
-        <w:rPr>
-          <w:b/>
-          <w:bCs/>
-          <w:color w:val="12355B"/>
-          <w:sz w:val="22"/>
-          <w:szCs w:val="22"/>
-        </w:rPr>
-        <w:t xml:space="preserve">4.  </w:t>
-      </w:r>
-      <w:r>
-        <w:rPr>
-          <w:b/>
-          <w:bCs/>
-          <w:sz w:val="21"/>
-          <w:szCs w:val="21"/>
-        </w:rPr>
-        <w:t xml:space="preserve">Which of these numbers is composite?</w:t>
-      </w:r>
-    </w:p>
-    <w:p>
-      <w:pPr>
-        <w:spacing w:after="40"/>
-        <w:ind w:left="420"/>
-      </w:pPr>
-      <w:r>
-        <w:rPr>
-          <w:sz w:val="20"/>
-          <w:szCs w:val="20"/>
-        </w:rPr>
-        <w:t xml:space="preserve">A)  27</w:t>
-      </w:r>
-    </w:p>
-    <w:p>
-      <w:pPr>
-        <w:spacing w:after="40"/>
-        <w:ind w:left="420"/>
-      </w:pPr>
-      <w:r>
-        <w:rPr>
-          <w:sz w:val="20"/>
-          <w:szCs w:val="20"/>
-        </w:rPr>
-        <w:t xml:space="preserve">B)  23</w:t>
-      </w:r>
-    </w:p>
-    <w:p>
-      <w:pPr>
-        <w:spacing w:after="40"/>
-        <w:ind w:left="420"/>
-      </w:pPr>
-      <w:r>
-        <w:rPr>
-          <w:sz w:val="20"/>
-          <w:szCs w:val="20"/>
-        </w:rPr>
-        <w:t xml:space="preserve">C)  29</w:t>
-      </w:r>
-    </w:p>
-    <w:p>
-      <w:pPr>
-        <w:spacing w:after="40"/>
-        <w:ind w:left="420"/>
-      </w:pPr>
-      <w:r>
-        <w:rPr>
-          <w:sz w:val="20"/>
-          <w:szCs w:val="20"/>
-        </w:rPr>
-        <w:t xml:space="preserve">D)  31</w:t>
-      </w:r>
-    </w:p>
-    <w:p>
-      <w:pPr>
-        <w:spacing w:after="20"/>
-      </w:pPr>
-      <w:r>
-        <w:t xml:space="preserve"/>
-      </w:r>
-    </w:p>
-    <w:tbl>
-      <w:tblPr>
-        <w:tblW w:type="pct" w:w="100%"/>
-        <w:tblBorders>
-          <w:top w:val="single" w:color="C7D2DD" w:sz="6"/>
-          <w:left w:val="single" w:color="C7D2DD" w:sz="6"/>
-          <w:bottom w:val="single" w:color="C7D2DD" w:sz="6"/>
-          <w:right w:val="single" w:color="C7D2DD" w:sz="6"/>
-          <w:insideH w:val="single" w:color="auto" w:sz="4"/>
-          <w:insideV w:val="single" w:color="auto" w:sz="4"/>
-        </w:tblBorders>
-      </w:tblPr>
-      <w:tblGrid>
-        <w:gridCol w:w="100"/>
-      </w:tblGrid>
-      <w:tr>
-        <w:tc>
-          <w:tcPr>
-            <w:shd w:fill="FBF3E2" w:color="auto" w:val="clear"/>
-            <w:tcMar>
-              <w:top w:type="dxa" w:w="60"/>
-              <w:left w:type="dxa" w:w="120"/>
-              <w:bottom w:type="dxa" w:w="60"/>
-              <w:right w:type="dxa" w:w="120"/>
-            </w:tcMar>
-          </w:tcPr>
-          <w:p>
-            <w:pPr>
-              <w:spacing w:after="0" w:line="320"/>
-            </w:pPr>
-            <w:r>
-              <w:t xml:space="preserve"/>
-            </w:r>
-          </w:p>
-          <w:p>
-            <w:pPr>
-              <w:spacing w:after="0" w:line="320"/>
-            </w:pPr>
-            <w:r>
-              <w:t xml:space="preserve"/>
-            </w:r>
-          </w:p>
-        </w:tc>
-      </w:tr>
-    </w:tbl>
-    <w:p>
-      <w:pPr>
         <w:pStyle w:val="Heading1"/>
         <w:pageBreakBefore/>
         <w:pBdr>
@@ -3103,6 +3199,64 @@
           <w:sz w:val="24"/>
           <w:szCs w:val="24"/>
         </w:rPr>
+        <w:t xml:space="preserve">Worked Notes (I Do / We Do)</w:t>
+      </w:r>
+    </w:p>
+    <w:p>
+      <w:pPr>
+        <w:spacing w:after="80"/>
+      </w:pPr>
+      <w:r>
+        <w:rPr>
+          <w:b/>
+          <w:bCs/>
+          <w:sz w:val="21"/>
+          <w:szCs w:val="21"/>
+        </w:rPr>
+        <w:t xml:space="preserve">I Do:  </w:t>
+      </w:r>
+      <w:r>
+        <w:rPr>
+          <w:sz w:val="21"/>
+          <w:szCs w:val="21"/>
+        </w:rPr>
+        <w:t xml:space="preserve">A. 17</w:t>
+      </w:r>
+    </w:p>
+    <w:p>
+      <w:pPr>
+        <w:spacing w:after="80"/>
+      </w:pPr>
+      <w:r>
+        <w:rPr>
+          <w:b/>
+          <w:bCs/>
+          <w:sz w:val="21"/>
+          <w:szCs w:val="21"/>
+        </w:rPr>
+        <w:t xml:space="preserve">We Do:  </w:t>
+      </w:r>
+      <w:r>
+        <w:rPr>
+          <w:sz w:val="21"/>
+          <w:szCs w:val="21"/>
+        </w:rPr>
+        <w:t xml:space="preserve">A. 2 × 3 × 5</w:t>
+      </w:r>
+    </w:p>
+    <w:p>
+      <w:pPr>
+        <w:pStyle w:val="Heading2"/>
+        <w:spacing w:after="80" w:before="180"/>
+      </w:pPr>
+      <w:r>
+        <w:rPr>
+          <w:b/>
+          <w:bCs/>
+          <w:color w:val="12355B"/>
+          <w:sz w:val="24"/>
+          <w:szCs w:val="24"/>
+        </w:rPr>
         <w:t xml:space="preserve">Independent Practice</w:t>
       </w:r>
     </w:p>
@@ -3124,7 +3278,7 @@
           <w:sz w:val="21"/>
           <w:szCs w:val="21"/>
         </w:rPr>
-        <w:t xml:space="preserve">A)  17</w:t>
+        <w:t xml:space="preserve">A)  2 × 3 × 3</w:t>
       </w:r>
       <w:r>
         <w:rPr>
@@ -3134,7 +3288,7 @@
           <w:sz w:val="19"/>
           <w:szCs w:val="19"/>
         </w:rPr>
-        <w:t xml:space="preserve">  — 17 has exactly two factors: 1 and 17. 15 = 3 × 5, 21 = 3 × 7, and 9 = 3 × 3, so they are all composite.</w:t>
+        <w:t xml:space="preserve">  — 18 = 2 × 9 = 2 × 3 × 3. Both 2 and 3 are prime, so 2 × 3 × 3 is the prime factorization.</w:t>
       </w:r>
     </w:p>
     <w:p>
@@ -3155,7 +3309,7 @@
           <w:sz w:val="21"/>
           <w:szCs w:val="21"/>
         </w:rPr>
-        <w:t xml:space="preserve">A)  2 × 3 × 5</w:t>
+        <w:t xml:space="preserve">A)  27</w:t>
       </w:r>
       <w:r>
         <w:rPr>
@@ -3165,7 +3319,7 @@
           <w:sz w:val="19"/>
           <w:szCs w:val="19"/>
         </w:rPr>
-        <w:t xml:space="preserve">  — 30 = 2 × 15 = 2 × 3 × 5. All three factors (2, 3, 5) are prime, so 2 × 3 × 5 is the prime factorization.</w:t>
+        <w:t xml:space="preserve">  — 27 = 3 × 9 = 3 × 3 × 3, so it has more than two factors. 23, 29, and 31 are all prime.</w:t>
       </w:r>
     </w:p>
     <w:p>
@@ -3186,7 +3340,7 @@
           <w:sz w:val="21"/>
           <w:szCs w:val="21"/>
         </w:rPr>
-        <w:t xml:space="preserve">A)  2 × 3 × 3</w:t>
+        <w:t xml:space="preserve">A)  Both get the same prime factorization: 2 × 2 × 3 × 5</w:t>
       </w:r>
       <w:r>
         <w:rPr>
@@ -3196,38 +3350,7 @@
           <w:sz w:val="19"/>
           <w:szCs w:val="19"/>
         </w:rPr>
-        <w:t xml:space="preserve">  — 18 = 2 × 9 = 2 × 3 × 3. Both 2 and 3 are prime, so 2 × 3 × 3 is the prime factorization.</w:t>
-      </w:r>
-    </w:p>
-    <w:p>
-      <w:pPr>
-        <w:spacing w:after="80"/>
-      </w:pPr>
-      <w:r>
-        <w:rPr>
-          <w:b/>
-          <w:bCs/>
-          <w:sz w:val="21"/>
-          <w:szCs w:val="21"/>
-        </w:rPr>
-        <w:t xml:space="preserve">4.  </w:t>
-      </w:r>
-      <w:r>
-        <w:rPr>
-          <w:sz w:val="21"/>
-          <w:szCs w:val="21"/>
-        </w:rPr>
-        <w:t xml:space="preserve">A)  27</w:t>
-      </w:r>
-      <w:r>
-        <w:rPr>
-          <w:i/>
-          <w:iCs/>
-          <w:color w:val="5F6F80"/>
-          <w:sz w:val="19"/>
-          <w:szCs w:val="19"/>
-        </w:rPr>
-        <w:t xml:space="preserve">  — 27 = 3 × 9 = 3 × 3 × 3, so it has more than two factors. 23, 29, and 31 are all prime.</w:t>
+        <w:t xml:space="preserve">  — The Fundamental Theorem of Arithmetic says every composite number has exactly one prime factorization. No matter how you start the factor tree, you always end with 2 × 2 × 3 × 5.</w:t>
       </w:r>
     </w:p>
     <w:p>

</xml_diff>

<commit_message>
feat(notes): redesign lesson notes as true fill-in-the-blank guided notes
- Use each vocab item's cloze sentence as numbered fill-in blanks with a
  Word Bank (HTML + DOCX), replacing the old empty 'record the key idea'
  lines so the notes are actually guided/fillable (TPT bestseller style).
- Trim the packet to guided-notes essentials: drop Interactive Projects,
  the TWR writing ladder, and Turn & Talk (they live in their own lesson
  resources); packet height ~7700px -> ~4900px.
- Flow blank answers into the teacher Answer Key.
- Prune now-dead section builders from both generators.
- Regenerate all 74 notes.html, .docx, and .pdf downloads.
</commit_message>
<xml_diff>
--- a/lessons/1-1-flagship/downloads/1-1-flagship-notes.docx
+++ b/lessons/1-1-flagship/downloads/1-1-flagship-notes.docx
@@ -1023,6 +1023,216 @@
     <w:p>
       <w:pPr>
         <w:pStyle w:val="Heading1"/>
+        <w:pBdr>
+          <w:bottom w:val="single" w:color="1FA6A2" w:sz="14" w:space="6"/>
+        </w:pBdr>
+        <w:spacing w:after="140" w:before="260"/>
+      </w:pPr>
+      <w:r>
+        <w:rPr>
+          <w:b/>
+          <w:bCs/>
+          <w:color w:val="12355B"/>
+          <w:sz w:val="30"/>
+          <w:szCs w:val="30"/>
+        </w:rPr>
+        <w:t xml:space="preserve">Guided Notes</w:t>
+      </w:r>
+    </w:p>
+    <w:p>
+      <w:pPr>
+        <w:spacing w:after="100"/>
+      </w:pPr>
+      <w:r>
+        <w:rPr>
+          <w:i/>
+          <w:iCs/>
+          <w:color w:val="5F6F80"/>
+          <w:sz w:val="19"/>
+          <w:szCs w:val="19"/>
+        </w:rPr>
+        <w:t xml:space="preserve">Fill in each blank as we go. Use the Word Bank to help you.</w:t>
+      </w:r>
+    </w:p>
+    <w:tbl>
+      <w:tblPr>
+        <w:tblW w:type="pct" w:w="100%"/>
+        <w:tblBorders>
+          <w:top w:val="single" w:color="BBD0DE" w:sz="8"/>
+          <w:left w:val="single" w:color="BBD0DE" w:sz="8"/>
+          <w:bottom w:val="single" w:color="BBD0DE" w:sz="8"/>
+          <w:right w:val="single" w:color="BBD0DE" w:sz="8"/>
+          <w:insideH w:val="single" w:color="auto" w:sz="4"/>
+          <w:insideV w:val="single" w:color="auto" w:sz="4"/>
+        </w:tblBorders>
+      </w:tblPr>
+      <w:tblGrid>
+        <w:gridCol w:w="100"/>
+      </w:tblGrid>
+      <w:tr>
+        <w:tc>
+          <w:tcPr>
+            <w:shd w:fill="EEF4F8" w:color="auto" w:val="clear"/>
+            <w:tcMar>
+              <w:top w:type="dxa" w:w="120"/>
+              <w:left w:type="dxa" w:w="180"/>
+              <w:bottom w:type="dxa" w:w="120"/>
+              <w:right w:type="dxa" w:w="180"/>
+            </w:tcMar>
+          </w:tcPr>
+          <w:p>
+            <w:pPr>
+              <w:spacing w:after="40"/>
+            </w:pPr>
+            <w:r>
+              <w:rPr>
+                <w:b/>
+                <w:bCs/>
+                <w:color w:val="1FA6A2"/>
+                <w:sz w:val="18"/>
+                <w:szCs w:val="18"/>
+              </w:rPr>
+              <w:t xml:space="preserve">WORD BANK</w:t>
+            </w:r>
+          </w:p>
+          <w:p>
+            <w:pPr>
+              <w:spacing w:after="80"/>
+            </w:pPr>
+            <w:r>
+              <w:rPr>
+                <w:b/>
+                <w:bCs/>
+                <w:sz w:val="21"/>
+                <w:szCs w:val="21"/>
+              </w:rPr>
+              <w:t xml:space="preserve">Prime number      •      Composite number      •      Prime factorization      •      Factor tree      •      Exponent</w:t>
+            </w:r>
+          </w:p>
+        </w:tc>
+      </w:tr>
+    </w:tbl>
+    <w:p>
+      <w:pPr>
+        <w:spacing w:after="80"/>
+      </w:pPr>
+      <w:r>
+        <w:t xml:space="preserve"/>
+      </w:r>
+    </w:p>
+    <w:p>
+      <w:pPr>
+        <w:spacing w:after="120" w:before="80"/>
+      </w:pPr>
+      <w:r>
+        <w:rPr>
+          <w:b/>
+          <w:bCs/>
+          <w:color w:val="12355B"/>
+          <w:sz w:val="22"/>
+          <w:szCs w:val="22"/>
+        </w:rPr>
+        <w:t xml:space="preserve">1.  </w:t>
+      </w:r>
+      <w:r>
+        <w:rPr>
+          <w:sz w:val="22"/>
+          <w:szCs w:val="22"/>
+        </w:rPr>
+        <w:t xml:space="preserve">A whole number greater than 1 with exactly two factors, 1 and itself, is a ___ number.</w:t>
+      </w:r>
+    </w:p>
+    <w:p>
+      <w:pPr>
+        <w:spacing w:after="120" w:before="80"/>
+      </w:pPr>
+      <w:r>
+        <w:rPr>
+          <w:b/>
+          <w:bCs/>
+          <w:color w:val="12355B"/>
+          <w:sz w:val="22"/>
+          <w:szCs w:val="22"/>
+        </w:rPr>
+        <w:t xml:space="preserve">2.  </w:t>
+      </w:r>
+      <w:r>
+        <w:rPr>
+          <w:sz w:val="22"/>
+          <w:szCs w:val="22"/>
+        </w:rPr>
+        <w:t xml:space="preserve">A whole number greater than 1 that has more than two factors is a ___ number.</w:t>
+      </w:r>
+    </w:p>
+    <w:p>
+      <w:pPr>
+        <w:spacing w:after="120" w:before="80"/>
+      </w:pPr>
+      <w:r>
+        <w:rPr>
+          <w:b/>
+          <w:bCs/>
+          <w:color w:val="12355B"/>
+          <w:sz w:val="22"/>
+          <w:szCs w:val="22"/>
+        </w:rPr>
+        <w:t xml:space="preserve">3.  </w:t>
+      </w:r>
+      <w:r>
+        <w:rPr>
+          <w:sz w:val="22"/>
+          <w:szCs w:val="22"/>
+        </w:rPr>
+        <w:t xml:space="preserve">__________  —  Writing a number as prime numbers multiplied together.</w:t>
+      </w:r>
+    </w:p>
+    <w:p>
+      <w:pPr>
+        <w:spacing w:after="120" w:before="80"/>
+      </w:pPr>
+      <w:r>
+        <w:rPr>
+          <w:b/>
+          <w:bCs/>
+          <w:color w:val="12355B"/>
+          <w:sz w:val="22"/>
+          <w:szCs w:val="22"/>
+        </w:rPr>
+        <w:t xml:space="preserve">4.  </w:t>
+      </w:r>
+      <w:r>
+        <w:rPr>
+          <w:sz w:val="22"/>
+          <w:szCs w:val="22"/>
+        </w:rPr>
+        <w:t xml:space="preserve">I can break a number into its prime factors step by step using a ___.</w:t>
+      </w:r>
+    </w:p>
+    <w:p>
+      <w:pPr>
+        <w:spacing w:after="120" w:before="80"/>
+      </w:pPr>
+      <w:r>
+        <w:rPr>
+          <w:b/>
+          <w:bCs/>
+          <w:color w:val="12355B"/>
+          <w:sz w:val="22"/>
+          <w:szCs w:val="22"/>
+        </w:rPr>
+        <w:t xml:space="preserve">5.  </w:t>
+      </w:r>
+      <w:r>
+        <w:rPr>
+          <w:sz w:val="22"/>
+          <w:szCs w:val="22"/>
+        </w:rPr>
+        <w:t xml:space="preserve">In 2³, the small number 3 is the ___ and it shows 2 is multiplied 3 times.</w:t>
+      </w:r>
+    </w:p>
+    <w:p>
+      <w:pPr>
+        <w:pStyle w:val="Heading1"/>
         <w:pageBreakBefore/>
         <w:pBdr>
           <w:bottom w:val="single" w:color="1FA6A2" w:sz="14" w:space="6"/>
@@ -2093,6 +2303,87 @@
     </w:p>
     <w:p>
       <w:pPr>
+        <w:spacing w:after="40" w:before="80"/>
+      </w:pPr>
+      <w:r>
+        <w:rPr>
+          <w:b/>
+          <w:bCs/>
+          <w:color w:val="12355B"/>
+          <w:sz w:val="21"/>
+          <w:szCs w:val="21"/>
+        </w:rPr>
+        <w:t xml:space="preserve">5. </w:t>
+      </w:r>
+      <w:r>
+        <w:rPr>
+          <w:b/>
+          <w:bCs/>
+          <w:color w:val="6B4FA0"/>
+          <w:sz w:val="19"/>
+          <w:szCs w:val="19"/>
+        </w:rPr>
+        <w:t xml:space="preserve">[Practice] </w:t>
+      </w:r>
+      <w:r>
+        <w:rPr>
+          <w:b/>
+          <w:bCs/>
+          <w:sz w:val="21"/>
+          <w:szCs w:val="21"/>
+        </w:rPr>
+        <w:t xml:space="preserve">During practice on Prime Factorization, what strategy did you use when a problem felt tricky?</w:t>
+      </w:r>
+    </w:p>
+    <w:p>
+      <w:pPr>
+        <w:spacing w:after="60"/>
+      </w:pPr>
+      <w:r>
+        <w:rPr>
+          <w:color w:val="1A2733"/>
+          <w:sz w:val="21"/>
+          <w:szCs w:val="21"/>
+        </w:rPr>
+        <w:t xml:space="preserve">Start with:  I broke 48 into ___ first because ___.</w:t>
+      </w:r>
+      <w:r>
+        <w:rPr>
+          <w:i/>
+          <w:iCs/>
+          <w:color w:val="5F6F80"/>
+          <w:sz w:val="19"/>
+          <w:szCs w:val="19"/>
+        </w:rPr>
+        <w:br/>
+        <w:t xml:space="preserve">Separé 48 en ___ primero porque ___.</w:t>
+      </w:r>
+    </w:p>
+    <w:p>
+      <w:pPr>
+        <w:spacing w:after="80"/>
+      </w:pPr>
+      <w:r>
+        <w:rPr>
+          <w:b/>
+          <w:bCs/>
+          <w:color w:val="12355B"/>
+          <w:sz w:val="19"/>
+          <w:szCs w:val="19"/>
+        </w:rPr>
+        <w:t xml:space="preserve">Word bank:  </w:t>
+      </w:r>
+      <w:r>
+        <w:rPr>
+          <w:color w:val="1FA6A2"/>
+          <w:sz w:val="19"/>
+          <w:szCs w:val="19"/>
+        </w:rPr>
+        <w:t xml:space="preserve">Prime number,  Composite number,  Prime factorization,  Factor tree</w:t>
+      </w:r>
+    </w:p>
+    <w:p>
+      <w:pPr>
         <w:pStyle w:val="Heading1"/>
         <w:pageBreakBefore/>
         <w:pBdr>
@@ -2544,99 +2835,97 @@
     </w:tbl>
     <w:p>
       <w:pPr>
-        <w:pStyle w:val="Heading1"/>
-        <w:pageBreakBefore/>
-        <w:pBdr>
-          <w:bottom w:val="single" w:color="1FA6A2" w:sz="14" w:space="6"/>
-        </w:pBdr>
-        <w:spacing w:after="140" w:before="0"/>
-      </w:pPr>
-      <w:r>
-        <w:rPr>
-          <w:b/>
-          <w:bCs/>
-          <w:color w:val="12355B"/>
-          <w:sz w:val="30"/>
-          <w:szCs w:val="30"/>
-        </w:rPr>
-        <w:t xml:space="preserve">Write About the Math</w:t>
-      </w:r>
-    </w:p>
-    <w:p>
-      <w:pPr>
-        <w:pStyle w:val="Heading2"/>
-        <w:spacing w:after="80" w:before="180"/>
-      </w:pPr>
-      <w:r>
-        <w:rPr>
-          <w:b/>
-          <w:bCs/>
-          <w:color w:val="12355B"/>
-          <w:sz w:val="24"/>
-          <w:szCs w:val="24"/>
-        </w:rPr>
-        <w:t xml:space="preserve">Build Strong Sentences</w:t>
-      </w:r>
-      <w:r>
-        <w:rPr>
-          <w:i/>
-          <w:iCs/>
-          <w:color w:val="B97A12"/>
-          <w:sz w:val="19"/>
-          <w:szCs w:val="19"/>
-        </w:rPr>
-        <w:t xml:space="preserve">   The Writing Revolution</w:t>
-      </w:r>
-    </w:p>
-    <w:p>
-      <w:pPr>
-        <w:spacing w:after="100"/>
-      </w:pPr>
-      <w:r>
-        <w:rPr>
-          <w:i/>
-          <w:iCs/>
-          <w:color w:val="5F6F80"/>
-          <w:sz w:val="19"/>
-          <w:szCs w:val="19"/>
-        </w:rPr>
-        <w:t xml:space="preserve">I can explain how I broke a number down using the words prime number, composite number, factor, and exponent.</w:t>
-      </w:r>
-    </w:p>
-    <w:p>
-      <w:pPr>
-        <w:pStyle w:val="Heading2"/>
-        <w:spacing w:after="80" w:before="180"/>
-      </w:pPr>
-      <w:r>
-        <w:rPr>
-          <w:b/>
-          <w:bCs/>
-          <w:color w:val="12355B"/>
-          <w:sz w:val="24"/>
-          <w:szCs w:val="24"/>
-        </w:rPr>
-        <w:t xml:space="preserve">1. Kernel Sentence</w:t>
-      </w:r>
-      <w:r>
-        <w:rPr>
-          <w:i/>
-          <w:iCs/>
-          <w:color w:val="1FA6A2"/>
-          <w:sz w:val="19"/>
-          <w:szCs w:val="19"/>
-        </w:rPr>
-        <w:t xml:space="preserve">   subject + verb</w:t>
+        <w:keepNext/>
+        <w:spacing w:after="60" w:before="160"/>
+      </w:pPr>
+      <w:r>
+        <w:rPr>
+          <w:b/>
+          <w:bCs/>
+          <w:color w:val="12355B"/>
+          <w:sz w:val="22"/>
+          <w:szCs w:val="22"/>
+        </w:rPr>
+        <w:t xml:space="preserve">4.  </w:t>
+      </w:r>
+      <w:r>
+        <w:rPr>
+          <w:b/>
+          <w:bCs/>
+          <w:sz w:val="21"/>
+          <w:szCs w:val="21"/>
+        </w:rPr>
+        <w:t xml:space="preserve">Lock 1 — Access clue: A whole number greater than 1 with exactly two factors (1 and itself) is called what?</w:t>
+      </w:r>
+    </w:p>
+    <w:p>
+      <w:pPr>
+        <w:spacing w:after="40"/>
+        <w:ind w:left="420"/>
+      </w:pPr>
+      <w:r>
+        <w:rPr>
+          <w:sz w:val="20"/>
+          <w:szCs w:val="20"/>
+        </w:rPr>
+        <w:t xml:space="preserve">A)  A prime number</w:t>
+      </w:r>
+    </w:p>
+    <w:p>
+      <w:pPr>
+        <w:spacing w:after="40"/>
+        <w:ind w:left="420"/>
+      </w:pPr>
+      <w:r>
+        <w:rPr>
+          <w:sz w:val="20"/>
+          <w:szCs w:val="20"/>
+        </w:rPr>
+        <w:t xml:space="preserve">B)  A composite number</w:t>
+      </w:r>
+    </w:p>
+    <w:p>
+      <w:pPr>
+        <w:spacing w:after="40"/>
+        <w:ind w:left="420"/>
+      </w:pPr>
+      <w:r>
+        <w:rPr>
+          <w:sz w:val="20"/>
+          <w:szCs w:val="20"/>
+        </w:rPr>
+        <w:t xml:space="preserve">C)  A factor tree</w:t>
+      </w:r>
+    </w:p>
+    <w:p>
+      <w:pPr>
+        <w:spacing w:after="40"/>
+        <w:ind w:left="420"/>
+      </w:pPr>
+      <w:r>
+        <w:rPr>
+          <w:sz w:val="20"/>
+          <w:szCs w:val="20"/>
+        </w:rPr>
+        <w:t xml:space="preserve">D)  An exponent</w:t>
+      </w:r>
+    </w:p>
+    <w:p>
+      <w:pPr>
+        <w:spacing w:after="20"/>
+      </w:pPr>
+      <w:r>
+        <w:t xml:space="preserve"/>
       </w:r>
     </w:p>
     <w:tbl>
       <w:tblPr>
         <w:tblW w:type="pct" w:w="100%"/>
         <w:tblBorders>
-          <w:top w:val="single" w:color="B97A12" w:sz="8"/>
-          <w:left w:val="single" w:color="B97A12" w:sz="8"/>
-          <w:bottom w:val="single" w:color="B97A12" w:sz="8"/>
-          <w:right w:val="single" w:color="B97A12" w:sz="8"/>
+          <w:top w:val="single" w:color="C7D2DD" w:sz="6"/>
+          <w:left w:val="single" w:color="C7D2DD" w:sz="6"/>
+          <w:bottom w:val="single" w:color="C7D2DD" w:sz="6"/>
+          <w:right w:val="single" w:color="C7D2DD" w:sz="6"/>
           <w:insideH w:val="single" w:color="auto" w:sz="4"/>
           <w:insideV w:val="single" w:color="auto" w:sz="4"/>
         </w:tblBorders>
@@ -2649,391 +2938,31 @@
           <w:tcPr>
             <w:shd w:fill="FBF3E2" w:color="auto" w:val="clear"/>
             <w:tcMar>
-              <w:top w:type="dxa" w:w="120"/>
-              <w:left w:type="dxa" w:w="180"/>
-              <w:bottom w:type="dxa" w:w="120"/>
-              <w:right w:type="dxa" w:w="180"/>
+              <w:top w:type="dxa" w:w="60"/>
+              <w:left w:type="dxa" w:w="120"/>
+              <w:bottom w:type="dxa" w:w="60"/>
+              <w:right w:type="dxa" w:w="120"/>
             </w:tcMar>
           </w:tcPr>
           <w:p>
             <w:pPr>
-              <w:spacing w:after="0"/>
-            </w:pPr>
-            <w:r>
-              <w:rPr>
-                <w:b/>
-                <w:bCs/>
-                <w:color w:val="1FA6A2"/>
-                <w:sz w:val="20"/>
-                <w:szCs w:val="20"/>
-              </w:rPr>
-              <w:t xml:space="preserve">Model:  </w:t>
-            </w:r>
-            <w:r>
-              <w:rPr>
-                <w:sz w:val="20"/>
-                <w:szCs w:val="20"/>
-              </w:rPr>
-              <w:t xml:space="preserve">Prime factorization is writing a number as prime numbers multiplied together.</w:t>
+              <w:spacing w:after="0" w:line="320"/>
+            </w:pPr>
+            <w:r>
+              <w:t xml:space="preserve"/>
+            </w:r>
+          </w:p>
+          <w:p>
+            <w:pPr>
+              <w:spacing w:after="0" w:line="320"/>
+            </w:pPr>
+            <w:r>
+              <w:t xml:space="preserve"/>
             </w:r>
           </w:p>
         </w:tc>
       </w:tr>
     </w:tbl>
-    <w:p>
-      <w:pPr>
-        <w:spacing w:after="40"/>
-      </w:pPr>
-      <w:r>
-        <w:t xml:space="preserve"/>
-      </w:r>
-    </w:p>
-    <w:p>
-      <w:pPr>
-        <w:spacing w:after="60"/>
-      </w:pPr>
-      <w:r>
-        <w:rPr>
-          <w:color w:val="1A2733"/>
-          <w:sz w:val="21"/>
-          <w:szCs w:val="21"/>
-        </w:rPr>
-        <w:t xml:space="preserve">Write a kernel sentence about prime factorization. Use a subject and a verb.</w:t>
-      </w:r>
-      <w:r>
-        <w:rPr>
-          <w:i/>
-          <w:iCs/>
-          <w:color w:val="5F6F80"/>
-          <w:sz w:val="19"/>
-          <w:szCs w:val="19"/>
-        </w:rPr>
-        <w:br/>
-        <w:t xml:space="preserve">Escribe una oración base sobre factorización prima. Usa un sujeto y un verbo.</w:t>
-      </w:r>
-    </w:p>
-    <w:p>
-      <w:pPr>
-        <w:pBdr>
-          <w:bottom w:val="single" w:color="AFBECC" w:sz="6"/>
-        </w:pBdr>
-        <w:spacing w:after="30" w:before="150"/>
-      </w:pPr>
-      <w:r>
-        <w:t xml:space="preserve"/>
-      </w:r>
-    </w:p>
-    <w:p>
-      <w:pPr>
-        <w:pBdr>
-          <w:bottom w:val="single" w:color="AFBECC" w:sz="6"/>
-        </w:pBdr>
-        <w:spacing w:after="30" w:before="150"/>
-      </w:pPr>
-      <w:r>
-        <w:t xml:space="preserve"/>
-      </w:r>
-    </w:p>
-    <w:p>
-      <w:pPr>
-        <w:pStyle w:val="Heading2"/>
-        <w:spacing w:after="80" w:before="180"/>
-      </w:pPr>
-      <w:r>
-        <w:rPr>
-          <w:b/>
-          <w:bCs/>
-          <w:color w:val="12355B"/>
-          <w:sz w:val="24"/>
-          <w:szCs w:val="24"/>
-        </w:rPr>
-        <w:t xml:space="preserve">2. Sentence Expansion</w:t>
-      </w:r>
-      <w:r>
-        <w:rPr>
-          <w:i/>
-          <w:iCs/>
-          <w:color w:val="1FA6A2"/>
-          <w:sz w:val="19"/>
-          <w:szCs w:val="19"/>
-        </w:rPr>
-        <w:t xml:space="preserve">   because · but · so</w:t>
-      </w:r>
-    </w:p>
-    <w:p>
-      <w:pPr>
-        <w:spacing w:after="80"/>
-      </w:pPr>
-      <w:r>
-        <w:rPr>
-          <w:b/>
-          <w:bCs/>
-          <w:color w:val="1FA6A2"/>
-          <w:sz w:val="20"/>
-          <w:szCs w:val="20"/>
-        </w:rPr>
-        <w:t xml:space="preserve">Kernel:  </w:t>
-      </w:r>
-      <w:r>
-        <w:rPr>
-          <w:sz w:val="20"/>
-          <w:szCs w:val="20"/>
-        </w:rPr>
-        <w:t xml:space="preserve">Prime factorization matters in math</w:t>
-      </w:r>
-    </w:p>
-    <w:p>
-      <w:pPr>
-        <w:spacing w:after="80"/>
-      </w:pPr>
-      <w:r>
-        <w:rPr>
-          <w:b/>
-          <w:bCs/>
-          <w:color w:val="12355B"/>
-          <w:sz w:val="21"/>
-          <w:szCs w:val="21"/>
-        </w:rPr>
-        <w:t xml:space="preserve">because  </w:t>
-      </w:r>
-      <w:r>
-        <w:rPr>
-          <w:sz w:val="21"/>
-          <w:szCs w:val="21"/>
-        </w:rPr>
-        <w:t xml:space="preserve">Prime factorization matters in math because ___.</w:t>
-      </w:r>
-      <w:r>
-        <w:rPr>
-          <w:i/>
-          <w:iCs/>
-          <w:color w:val="5F6F80"/>
-          <w:sz w:val="19"/>
-          <w:szCs w:val="19"/>
-        </w:rPr>
-        <w:br/>
-        <w:t xml:space="preserve">Factorización prima importa en matemáticas porque ___.</w:t>
-      </w:r>
-    </w:p>
-    <w:p>
-      <w:pPr>
-        <w:pBdr>
-          <w:bottom w:val="single" w:color="AFBECC" w:sz="6"/>
-        </w:pBdr>
-        <w:spacing w:after="30" w:before="150"/>
-      </w:pPr>
-      <w:r>
-        <w:t xml:space="preserve"/>
-      </w:r>
-    </w:p>
-    <w:p>
-      <w:pPr>
-        <w:spacing w:after="80"/>
-      </w:pPr>
-      <w:r>
-        <w:rPr>
-          <w:b/>
-          <w:bCs/>
-          <w:color w:val="12355B"/>
-          <w:sz w:val="21"/>
-          <w:szCs w:val="21"/>
-        </w:rPr>
-        <w:t xml:space="preserve">but  </w:t>
-      </w:r>
-      <w:r>
-        <w:rPr>
-          <w:sz w:val="21"/>
-          <w:szCs w:val="21"/>
-        </w:rPr>
-        <w:t xml:space="preserve">Prime factorization matters in math, but ___.</w:t>
-      </w:r>
-      <w:r>
-        <w:rPr>
-          <w:i/>
-          <w:iCs/>
-          <w:color w:val="5F6F80"/>
-          <w:sz w:val="19"/>
-          <w:szCs w:val="19"/>
-        </w:rPr>
-        <w:br/>
-        <w:t xml:space="preserve">Factorización prima importa en matemáticas, pero ___.</w:t>
-      </w:r>
-    </w:p>
-    <w:p>
-      <w:pPr>
-        <w:pBdr>
-          <w:bottom w:val="single" w:color="AFBECC" w:sz="6"/>
-        </w:pBdr>
-        <w:spacing w:after="30" w:before="150"/>
-      </w:pPr>
-      <w:r>
-        <w:t xml:space="preserve"/>
-      </w:r>
-    </w:p>
-    <w:p>
-      <w:pPr>
-        <w:spacing w:after="80"/>
-      </w:pPr>
-      <w:r>
-        <w:rPr>
-          <w:b/>
-          <w:bCs/>
-          <w:color w:val="12355B"/>
-          <w:sz w:val="21"/>
-          <w:szCs w:val="21"/>
-        </w:rPr>
-        <w:t xml:space="preserve">so  </w:t>
-      </w:r>
-      <w:r>
-        <w:rPr>
-          <w:sz w:val="21"/>
-          <w:szCs w:val="21"/>
-        </w:rPr>
-        <w:t xml:space="preserve">Prime factorization matters in math, so ___.</w:t>
-      </w:r>
-      <w:r>
-        <w:rPr>
-          <w:i/>
-          <w:iCs/>
-          <w:color w:val="5F6F80"/>
-          <w:sz w:val="19"/>
-          <w:szCs w:val="19"/>
-        </w:rPr>
-        <w:br/>
-        <w:t xml:space="preserve">Factorización prima importa en matemáticas, entonces ___.</w:t>
-      </w:r>
-    </w:p>
-    <w:p>
-      <w:pPr>
-        <w:pBdr>
-          <w:bottom w:val="single" w:color="AFBECC" w:sz="6"/>
-        </w:pBdr>
-        <w:spacing w:after="30" w:before="150"/>
-      </w:pPr>
-      <w:r>
-        <w:t xml:space="preserve"/>
-      </w:r>
-    </w:p>
-    <w:p>
-      <w:pPr>
-        <w:pStyle w:val="Heading2"/>
-        <w:spacing w:after="80" w:before="180"/>
-      </w:pPr>
-      <w:r>
-        <w:rPr>
-          <w:b/>
-          <w:bCs/>
-          <w:color w:val="12355B"/>
-          <w:sz w:val="24"/>
-          <w:szCs w:val="24"/>
-        </w:rPr>
-        <w:t xml:space="preserve">3. Explain Your Reasoning</w:t>
-      </w:r>
-      <w:r>
-        <w:rPr>
-          <w:i/>
-          <w:iCs/>
-          <w:color w:val="1FA6A2"/>
-          <w:sz w:val="19"/>
-          <w:szCs w:val="19"/>
-        </w:rPr>
-        <w:t xml:space="preserve">   use a sentence starter</w:t>
-      </w:r>
-    </w:p>
-    <w:p>
-      <w:pPr>
-        <w:spacing w:after="60"/>
-      </w:pPr>
-      <w:r>
-        <w:rPr>
-          <w:color w:val="1A2733"/>
-          <w:sz w:val="21"/>
-          <w:szCs w:val="21"/>
-        </w:rPr>
-        <w:t xml:space="preserve">48 is a ___ number because it has ___.</w:t>
-      </w:r>
-      <w:r>
-        <w:rPr>
-          <w:i/>
-          <w:iCs/>
-          <w:color w:val="5F6F80"/>
-          <w:sz w:val="19"/>
-          <w:szCs w:val="19"/>
-        </w:rPr>
-        <w:br/>
-        <w:t xml:space="preserve">48 es un número ___ porque tiene ___.</w:t>
-      </w:r>
-    </w:p>
-    <w:p>
-      <w:pPr>
-        <w:spacing w:after="60"/>
-      </w:pPr>
-      <w:r>
-        <w:rPr>
-          <w:color w:val="1A2733"/>
-          <w:sz w:val="21"/>
-          <w:szCs w:val="21"/>
-        </w:rPr>
-        <w:t xml:space="preserve">I can tell before factoring because ___.</w:t>
-      </w:r>
-      <w:r>
-        <w:rPr>
-          <w:i/>
-          <w:iCs/>
-          <w:color w:val="5F6F80"/>
-          <w:sz w:val="19"/>
-          <w:szCs w:val="19"/>
-        </w:rPr>
-        <w:br/>
-        <w:t xml:space="preserve">Puedo saberlo antes de factorizar porque ___.</w:t>
-      </w:r>
-    </w:p>
-    <w:p>
-      <w:pPr>
-        <w:spacing w:after="60"/>
-      </w:pPr>
-      <w:r>
-        <w:rPr>
-          <w:color w:val="1A2733"/>
-          <w:sz w:val="21"/>
-          <w:szCs w:val="21"/>
-        </w:rPr>
-        <w:t xml:space="preserve">I broke 48 into ___ first because ___.</w:t>
-      </w:r>
-      <w:r>
-        <w:rPr>
-          <w:i/>
-          <w:iCs/>
-          <w:color w:val="5F6F80"/>
-          <w:sz w:val="19"/>
-          <w:szCs w:val="19"/>
-        </w:rPr>
-        <w:br/>
-        <w:t xml:space="preserve">Separé 48 en ___ primero porque ___.</w:t>
-      </w:r>
-    </w:p>
-    <w:p>
-      <w:pPr>
-        <w:pBdr>
-          <w:bottom w:val="single" w:color="AFBECC" w:sz="6"/>
-        </w:pBdr>
-        <w:spacing w:after="30" w:before="150"/>
-      </w:pPr>
-      <w:r>
-        <w:t xml:space="preserve"/>
-      </w:r>
-    </w:p>
-    <w:p>
-      <w:pPr>
-        <w:pBdr>
-          <w:bottom w:val="single" w:color="AFBECC" w:sz="6"/>
-        </w:pBdr>
-        <w:spacing w:after="30" w:before="150"/>
-      </w:pPr>
-      <w:r>
-        <w:t xml:space="preserve"/>
-      </w:r>
-    </w:p>
     <w:p>
       <w:pPr>
         <w:pStyle w:val="Heading1"/>
@@ -3199,6 +3128,127 @@
           <w:sz w:val="24"/>
           <w:szCs w:val="24"/>
         </w:rPr>
+        <w:t xml:space="preserve">Guided Notes (Fill-in)</w:t>
+      </w:r>
+    </w:p>
+    <w:p>
+      <w:pPr>
+        <w:spacing w:after="80"/>
+      </w:pPr>
+      <w:r>
+        <w:rPr>
+          <w:b/>
+          <w:bCs/>
+          <w:sz w:val="21"/>
+          <w:szCs w:val="21"/>
+        </w:rPr>
+        <w:t xml:space="preserve">Notes 1:  </w:t>
+      </w:r>
+      <w:r>
+        <w:rPr>
+          <w:sz w:val="21"/>
+          <w:szCs w:val="21"/>
+        </w:rPr>
+        <w:t xml:space="preserve">Prime number</w:t>
+      </w:r>
+    </w:p>
+    <w:p>
+      <w:pPr>
+        <w:spacing w:after="80"/>
+      </w:pPr>
+      <w:r>
+        <w:rPr>
+          <w:b/>
+          <w:bCs/>
+          <w:sz w:val="21"/>
+          <w:szCs w:val="21"/>
+        </w:rPr>
+        <w:t xml:space="preserve">Notes 2:  </w:t>
+      </w:r>
+      <w:r>
+        <w:rPr>
+          <w:sz w:val="21"/>
+          <w:szCs w:val="21"/>
+        </w:rPr>
+        <w:t xml:space="preserve">Composite number</w:t>
+      </w:r>
+    </w:p>
+    <w:p>
+      <w:pPr>
+        <w:spacing w:after="80"/>
+      </w:pPr>
+      <w:r>
+        <w:rPr>
+          <w:b/>
+          <w:bCs/>
+          <w:sz w:val="21"/>
+          <w:szCs w:val="21"/>
+        </w:rPr>
+        <w:t xml:space="preserve">Notes 3:  </w:t>
+      </w:r>
+      <w:r>
+        <w:rPr>
+          <w:sz w:val="21"/>
+          <w:szCs w:val="21"/>
+        </w:rPr>
+        <w:t xml:space="preserve">Prime factorization</w:t>
+      </w:r>
+    </w:p>
+    <w:p>
+      <w:pPr>
+        <w:spacing w:after="80"/>
+      </w:pPr>
+      <w:r>
+        <w:rPr>
+          <w:b/>
+          <w:bCs/>
+          <w:sz w:val="21"/>
+          <w:szCs w:val="21"/>
+        </w:rPr>
+        <w:t xml:space="preserve">Notes 4:  </w:t>
+      </w:r>
+      <w:r>
+        <w:rPr>
+          <w:sz w:val="21"/>
+          <w:szCs w:val="21"/>
+        </w:rPr>
+        <w:t xml:space="preserve">Factor tree</w:t>
+      </w:r>
+    </w:p>
+    <w:p>
+      <w:pPr>
+        <w:spacing w:after="80"/>
+      </w:pPr>
+      <w:r>
+        <w:rPr>
+          <w:b/>
+          <w:bCs/>
+          <w:sz w:val="21"/>
+          <w:szCs w:val="21"/>
+        </w:rPr>
+        <w:t xml:space="preserve">Notes 5:  </w:t>
+      </w:r>
+      <w:r>
+        <w:rPr>
+          <w:sz w:val="21"/>
+          <w:szCs w:val="21"/>
+        </w:rPr>
+        <w:t xml:space="preserve">Exponent</w:t>
+      </w:r>
+    </w:p>
+    <w:p>
+      <w:pPr>
+        <w:pStyle w:val="Heading2"/>
+        <w:spacing w:after="80" w:before="180"/>
+      </w:pPr>
+      <w:r>
+        <w:rPr>
+          <w:b/>
+          <w:bCs/>
+          <w:color w:val="12355B"/>
+          <w:sz w:val="24"/>
+          <w:szCs w:val="24"/>
+        </w:rPr>
         <w:t xml:space="preserve">Worked Notes (I Do / We Do)</w:t>
       </w:r>
     </w:p>
@@ -3355,30 +3405,23 @@
     </w:p>
     <w:p>
       <w:pPr>
-        <w:pStyle w:val="Heading2"/>
-        <w:spacing w:after="80" w:before="180"/>
-      </w:pPr>
-      <w:r>
-        <w:rPr>
-          <w:b/>
-          <w:bCs/>
-          <w:color w:val="12355B"/>
-          <w:sz w:val="24"/>
-          <w:szCs w:val="24"/>
-        </w:rPr>
-        <w:t xml:space="preserve">Exit Ticket</w:t>
-      </w:r>
-    </w:p>
-    <w:p>
-      <w:pPr>
         <w:spacing w:after="80"/>
       </w:pPr>
       <w:r>
         <w:rPr>
-          <w:sz w:val="21"/>
-          <w:szCs w:val="21"/>
-        </w:rPr>
-        <w:t xml:space="preserve">A)  2 × 2 × 2 × 5</w:t>
+          <w:b/>
+          <w:bCs/>
+          <w:sz w:val="21"/>
+          <w:szCs w:val="21"/>
+        </w:rPr>
+        <w:t xml:space="preserve">4.  </w:t>
+      </w:r>
+      <w:r>
+        <w:rPr>
+          <w:sz w:val="21"/>
+          <w:szCs w:val="21"/>
+        </w:rPr>
+        <w:t xml:space="preserve">A)  A prime number</w:t>
       </w:r>
       <w:r>
         <w:rPr>
@@ -3388,7 +3431,7 @@
           <w:sz w:val="19"/>
           <w:szCs w:val="19"/>
         </w:rPr>
-        <w:t xml:space="preserve">  — 40 = 2 × 20 = 2 × 2 × 10 = 2 × 2 × 2 × 5. All factors (2, 2, 2, 5) are prime.</w:t>
+        <w:t xml:space="preserve">  — A prime number has exactly two factors: 1 and itself. A composite number has more than two factors.</w:t>
       </w:r>
     </w:p>
     <w:p>
@@ -3404,7 +3447,7 @@
           <w:sz w:val="24"/>
           <w:szCs w:val="24"/>
         </w:rPr>
-        <w:t xml:space="preserve">Writing (TWR) — what to look for</w:t>
+        <w:t xml:space="preserve">Exit Ticket</w:t>
       </w:r>
     </w:p>
     <w:p>
@@ -3413,52 +3456,10 @@
       </w:pPr>
       <w:r>
         <w:rPr>
-          <w:sz w:val="20"/>
-          <w:szCs w:val="20"/>
-        </w:rPr>
-        <w:t xml:space="preserve">Kernel sentence: a complete sentence needs a subject and a verb. Example: Prime factorization is writing a number as prime numbers multiplied together.</w:t>
-      </w:r>
-    </w:p>
-    <w:p>
-      <w:pPr>
-        <w:spacing w:after="80"/>
-      </w:pPr>
-      <w:r>
-        <w:rPr>
-          <w:sz w:val="20"/>
-          <w:szCs w:val="20"/>
-        </w:rPr>
-        <w:t xml:space="preserve">Expansion: because = reason, but = contrast/exception, so = result. Answers vary; each must keep the kernel idea.</w:t>
-      </w:r>
-    </w:p>
-    <w:p>
-      <w:pPr>
-        <w:pStyle w:val="Heading2"/>
-        <w:spacing w:after="80" w:before="180"/>
-      </w:pPr>
-      <w:r>
-        <w:rPr>
-          <w:b/>
-          <w:bCs/>
-          <w:color w:val="12355B"/>
-          <w:sz w:val="24"/>
-          <w:szCs w:val="24"/>
-        </w:rPr>
-        <w:t xml:space="preserve">Turn &amp; Talk — listen for</w:t>
-      </w:r>
-    </w:p>
-    <w:p>
-      <w:pPr>
-        <w:spacing w:after="80"/>
-      </w:pPr>
-      <w:r>
-        <w:rPr>
-          <w:b/>
-          <w:bCs/>
-          <w:sz w:val="19"/>
-          <w:szCs w:val="19"/>
-        </w:rPr>
-        <w:t xml:space="preserve">1.  </w:t>
+          <w:sz w:val="21"/>
+          <w:szCs w:val="21"/>
+        </w:rPr>
+        <w:t xml:space="preserve">A)  2 × 2 × 2 × 5</w:t>
       </w:r>
       <w:r>
         <w:rPr>
@@ -3468,79 +3469,7 @@
           <w:sz w:val="19"/>
           <w:szCs w:val="19"/>
         </w:rPr>
-        <w:t xml:space="preserve">Students say 48 is composite because it has more than two factors (divisible by 2, 3, 4, 6, ...), so it can be broken into smaller groups.</w:t>
-      </w:r>
-    </w:p>
-    <w:p>
-      <w:pPr>
-        <w:spacing w:after="80"/>
-      </w:pPr>
-      <w:r>
-        <w:rPr>
-          <w:b/>
-          <w:bCs/>
-          <w:sz w:val="19"/>
-          <w:szCs w:val="19"/>
-        </w:rPr>
-        <w:t xml:space="preserve">2.  </w:t>
-      </w:r>
-      <w:r>
-        <w:rPr>
-          <w:i/>
-          <w:iCs/>
-          <w:color w:val="5F6F80"/>
-          <w:sz w:val="19"/>
-          <w:szCs w:val="19"/>
-        </w:rPr>
-        <w:t xml:space="preserve">Students explain they keep splitting composite branches and stop when every leaf is prime, ending with 48 = 2 × 2 × 2 × 2 × 3.</w:t>
-      </w:r>
-    </w:p>
-    <w:p>
-      <w:pPr>
-        <w:spacing w:after="80"/>
-      </w:pPr>
-      <w:r>
-        <w:rPr>
-          <w:b/>
-          <w:bCs/>
-          <w:sz w:val="19"/>
-          <w:szCs w:val="19"/>
-        </w:rPr>
-        <w:t xml:space="preserve">3.  </w:t>
-      </w:r>
-      <w:r>
-        <w:rPr>
-          <w:i/>
-          <w:iCs/>
-          <w:color w:val="5F6F80"/>
-          <w:sz w:val="19"/>
-          <w:szCs w:val="19"/>
-        </w:rPr>
-        <w:t xml:space="preserve">Students give 84 = 2 × 2 × 3 × 7 = 2² × 3 × 7 and reason that multiplying combinations of those primes produces all factors of 84, which are the possible equal-row sizes.</w:t>
-      </w:r>
-    </w:p>
-    <w:p>
-      <w:pPr>
-        <w:spacing w:after="80"/>
-      </w:pPr>
-      <w:r>
-        <w:rPr>
-          <w:b/>
-          <w:bCs/>
-          <w:sz w:val="19"/>
-          <w:szCs w:val="19"/>
-        </w:rPr>
-        <w:t xml:space="preserve">4.  </w:t>
-      </w:r>
-      <w:r>
-        <w:rPr>
-          <w:i/>
-          <w:iCs/>
-          <w:color w:val="5F6F80"/>
-          <w:sz w:val="19"/>
-          <w:szCs w:val="19"/>
-        </w:rPr>
-        <w:t xml:space="preserve">Students explain that breaking down different starting splits still reduces to the same prime factors, so the prime factorization is unique (the Fundamental Theorem of Arithmetic in plain words).</w:t>
+        <w:t xml:space="preserve">  — 40 = 2 × 20 = 2 × 2 × 10 = 2 × 2 × 2 × 5. All factors (2, 2, 2, 5) are prime.</w:t>
       </w:r>
     </w:p>
     <w:sectPr>

</xml_diff>

<commit_message>
feat(notes): interactive guided notes — name fields, vocab pop-ups, drag-drop activities; split teacher answer key
- Header Name/Date/Class are now typeable inputs (auto-saved per device).
- Guided-notes word bank: tap any term for a pop-up with its meaning + picture.
- Universal tap-to-pair vocabulary Match-up in every lesson.
- Drag-and-drop 'put the steps in order' (▲▼ + keyboard fallback) on the
  multi-step worked examples; larger, clearer Watch & Try visuals.
- Answer Key & Teacher Guide removed from student notes; now a separate
  Teacher Copy (notes-teacher.html + -teacher PDF/DOCX) with a banner,
  linked from the teacher notes index. Student PDF/DOCX are answer-key-free.
- vite.config: copy notes-teacher.html (and prior worksheet.html) into dist.
- Regenerated all 74 notes (student + teacher), 148 PDFs, 148 DOCX.
</commit_message>
<xml_diff>
--- a/lessons/1-1-flagship/downloads/1-1-flagship-notes.docx
+++ b/lessons/1-1-flagship/downloads/1-1-flagship-notes.docx
@@ -3078,398 +3078,6 @@
       </w:pPr>
       <w:r>
         <w:t xml:space="preserve"/>
-      </w:r>
-    </w:p>
-    <w:p>
-      <w:pPr>
-        <w:pStyle w:val="Heading1"/>
-        <w:pageBreakBefore/>
-        <w:pBdr>
-          <w:bottom w:val="single" w:color="1FA6A2" w:sz="14" w:space="6"/>
-        </w:pBdr>
-        <w:spacing w:after="140" w:before="0"/>
-      </w:pPr>
-      <w:r>
-        <w:rPr>
-          <w:b/>
-          <w:bCs/>
-          <w:color w:val="12355B"/>
-          <w:sz w:val="30"/>
-          <w:szCs w:val="30"/>
-        </w:rPr>
-        <w:t xml:space="preserve">Answer Key &amp; Teacher Guide</w:t>
-      </w:r>
-    </w:p>
-    <w:p>
-      <w:pPr>
-        <w:spacing w:after="100"/>
-      </w:pPr>
-      <w:r>
-        <w:rPr>
-          <w:i/>
-          <w:iCs/>
-          <w:color w:val="5F6F80"/>
-          <w:sz w:val="19"/>
-          <w:szCs w:val="19"/>
-        </w:rPr>
-        <w:t xml:space="preserve">Teacher reference — remove or fold back before distributing to students.</w:t>
-      </w:r>
-    </w:p>
-    <w:p>
-      <w:pPr>
-        <w:pStyle w:val="Heading2"/>
-        <w:spacing w:after="80" w:before="180"/>
-      </w:pPr>
-      <w:r>
-        <w:rPr>
-          <w:b/>
-          <w:bCs/>
-          <w:color w:val="12355B"/>
-          <w:sz w:val="24"/>
-          <w:szCs w:val="24"/>
-        </w:rPr>
-        <w:t xml:space="preserve">Guided Notes (Fill-in)</w:t>
-      </w:r>
-    </w:p>
-    <w:p>
-      <w:pPr>
-        <w:spacing w:after="80"/>
-      </w:pPr>
-      <w:r>
-        <w:rPr>
-          <w:b/>
-          <w:bCs/>
-          <w:sz w:val="21"/>
-          <w:szCs w:val="21"/>
-        </w:rPr>
-        <w:t xml:space="preserve">Notes 1:  </w:t>
-      </w:r>
-      <w:r>
-        <w:rPr>
-          <w:sz w:val="21"/>
-          <w:szCs w:val="21"/>
-        </w:rPr>
-        <w:t xml:space="preserve">Prime number</w:t>
-      </w:r>
-    </w:p>
-    <w:p>
-      <w:pPr>
-        <w:spacing w:after="80"/>
-      </w:pPr>
-      <w:r>
-        <w:rPr>
-          <w:b/>
-          <w:bCs/>
-          <w:sz w:val="21"/>
-          <w:szCs w:val="21"/>
-        </w:rPr>
-        <w:t xml:space="preserve">Notes 2:  </w:t>
-      </w:r>
-      <w:r>
-        <w:rPr>
-          <w:sz w:val="21"/>
-          <w:szCs w:val="21"/>
-        </w:rPr>
-        <w:t xml:space="preserve">Composite number</w:t>
-      </w:r>
-    </w:p>
-    <w:p>
-      <w:pPr>
-        <w:spacing w:after="80"/>
-      </w:pPr>
-      <w:r>
-        <w:rPr>
-          <w:b/>
-          <w:bCs/>
-          <w:sz w:val="21"/>
-          <w:szCs w:val="21"/>
-        </w:rPr>
-        <w:t xml:space="preserve">Notes 3:  </w:t>
-      </w:r>
-      <w:r>
-        <w:rPr>
-          <w:sz w:val="21"/>
-          <w:szCs w:val="21"/>
-        </w:rPr>
-        <w:t xml:space="preserve">Prime factorization</w:t>
-      </w:r>
-    </w:p>
-    <w:p>
-      <w:pPr>
-        <w:spacing w:after="80"/>
-      </w:pPr>
-      <w:r>
-        <w:rPr>
-          <w:b/>
-          <w:bCs/>
-          <w:sz w:val="21"/>
-          <w:szCs w:val="21"/>
-        </w:rPr>
-        <w:t xml:space="preserve">Notes 4:  </w:t>
-      </w:r>
-      <w:r>
-        <w:rPr>
-          <w:sz w:val="21"/>
-          <w:szCs w:val="21"/>
-        </w:rPr>
-        <w:t xml:space="preserve">Factor tree</w:t>
-      </w:r>
-    </w:p>
-    <w:p>
-      <w:pPr>
-        <w:spacing w:after="80"/>
-      </w:pPr>
-      <w:r>
-        <w:rPr>
-          <w:b/>
-          <w:bCs/>
-          <w:sz w:val="21"/>
-          <w:szCs w:val="21"/>
-        </w:rPr>
-        <w:t xml:space="preserve">Notes 5:  </w:t>
-      </w:r>
-      <w:r>
-        <w:rPr>
-          <w:sz w:val="21"/>
-          <w:szCs w:val="21"/>
-        </w:rPr>
-        <w:t xml:space="preserve">Exponent</w:t>
-      </w:r>
-    </w:p>
-    <w:p>
-      <w:pPr>
-        <w:pStyle w:val="Heading2"/>
-        <w:spacing w:after="80" w:before="180"/>
-      </w:pPr>
-      <w:r>
-        <w:rPr>
-          <w:b/>
-          <w:bCs/>
-          <w:color w:val="12355B"/>
-          <w:sz w:val="24"/>
-          <w:szCs w:val="24"/>
-        </w:rPr>
-        <w:t xml:space="preserve">Worked Notes (I Do / We Do)</w:t>
-      </w:r>
-    </w:p>
-    <w:p>
-      <w:pPr>
-        <w:spacing w:after="80"/>
-      </w:pPr>
-      <w:r>
-        <w:rPr>
-          <w:b/>
-          <w:bCs/>
-          <w:sz w:val="21"/>
-          <w:szCs w:val="21"/>
-        </w:rPr>
-        <w:t xml:space="preserve">I Do:  </w:t>
-      </w:r>
-      <w:r>
-        <w:rPr>
-          <w:sz w:val="21"/>
-          <w:szCs w:val="21"/>
-        </w:rPr>
-        <w:t xml:space="preserve">A. 17</w:t>
-      </w:r>
-    </w:p>
-    <w:p>
-      <w:pPr>
-        <w:spacing w:after="80"/>
-      </w:pPr>
-      <w:r>
-        <w:rPr>
-          <w:b/>
-          <w:bCs/>
-          <w:sz w:val="21"/>
-          <w:szCs w:val="21"/>
-        </w:rPr>
-        <w:t xml:space="preserve">We Do:  </w:t>
-      </w:r>
-      <w:r>
-        <w:rPr>
-          <w:sz w:val="21"/>
-          <w:szCs w:val="21"/>
-        </w:rPr>
-        <w:t xml:space="preserve">A. 2 × 3 × 5</w:t>
-      </w:r>
-    </w:p>
-    <w:p>
-      <w:pPr>
-        <w:pStyle w:val="Heading2"/>
-        <w:spacing w:after="80" w:before="180"/>
-      </w:pPr>
-      <w:r>
-        <w:rPr>
-          <w:b/>
-          <w:bCs/>
-          <w:color w:val="12355B"/>
-          <w:sz w:val="24"/>
-          <w:szCs w:val="24"/>
-        </w:rPr>
-        <w:t xml:space="preserve">Independent Practice</w:t>
-      </w:r>
-    </w:p>
-    <w:p>
-      <w:pPr>
-        <w:spacing w:after="80"/>
-      </w:pPr>
-      <w:r>
-        <w:rPr>
-          <w:b/>
-          <w:bCs/>
-          <w:sz w:val="21"/>
-          <w:szCs w:val="21"/>
-        </w:rPr>
-        <w:t xml:space="preserve">1.  </w:t>
-      </w:r>
-      <w:r>
-        <w:rPr>
-          <w:sz w:val="21"/>
-          <w:szCs w:val="21"/>
-        </w:rPr>
-        <w:t xml:space="preserve">A)  2 × 3 × 3</w:t>
-      </w:r>
-      <w:r>
-        <w:rPr>
-          <w:i/>
-          <w:iCs/>
-          <w:color w:val="5F6F80"/>
-          <w:sz w:val="19"/>
-          <w:szCs w:val="19"/>
-        </w:rPr>
-        <w:t xml:space="preserve">  — 18 = 2 × 9 = 2 × 3 × 3. Both 2 and 3 are prime, so 2 × 3 × 3 is the prime factorization.</w:t>
-      </w:r>
-    </w:p>
-    <w:p>
-      <w:pPr>
-        <w:spacing w:after="80"/>
-      </w:pPr>
-      <w:r>
-        <w:rPr>
-          <w:b/>
-          <w:bCs/>
-          <w:sz w:val="21"/>
-          <w:szCs w:val="21"/>
-        </w:rPr>
-        <w:t xml:space="preserve">2.  </w:t>
-      </w:r>
-      <w:r>
-        <w:rPr>
-          <w:sz w:val="21"/>
-          <w:szCs w:val="21"/>
-        </w:rPr>
-        <w:t xml:space="preserve">A)  27</w:t>
-      </w:r>
-      <w:r>
-        <w:rPr>
-          <w:i/>
-          <w:iCs/>
-          <w:color w:val="5F6F80"/>
-          <w:sz w:val="19"/>
-          <w:szCs w:val="19"/>
-        </w:rPr>
-        <w:t xml:space="preserve">  — 27 = 3 × 9 = 3 × 3 × 3, so it has more than two factors. 23, 29, and 31 are all prime.</w:t>
-      </w:r>
-    </w:p>
-    <w:p>
-      <w:pPr>
-        <w:spacing w:after="80"/>
-      </w:pPr>
-      <w:r>
-        <w:rPr>
-          <w:b/>
-          <w:bCs/>
-          <w:sz w:val="21"/>
-          <w:szCs w:val="21"/>
-        </w:rPr>
-        <w:t xml:space="preserve">3.  </w:t>
-      </w:r>
-      <w:r>
-        <w:rPr>
-          <w:sz w:val="21"/>
-          <w:szCs w:val="21"/>
-        </w:rPr>
-        <w:t xml:space="preserve">A)  Both get the same prime factorization: 2 × 2 × 3 × 5</w:t>
-      </w:r>
-      <w:r>
-        <w:rPr>
-          <w:i/>
-          <w:iCs/>
-          <w:color w:val="5F6F80"/>
-          <w:sz w:val="19"/>
-          <w:szCs w:val="19"/>
-        </w:rPr>
-        <w:t xml:space="preserve">  — The Fundamental Theorem of Arithmetic says every composite number has exactly one prime factorization. No matter how you start the factor tree, you always end with 2 × 2 × 3 × 5.</w:t>
-      </w:r>
-    </w:p>
-    <w:p>
-      <w:pPr>
-        <w:spacing w:after="80"/>
-      </w:pPr>
-      <w:r>
-        <w:rPr>
-          <w:b/>
-          <w:bCs/>
-          <w:sz w:val="21"/>
-          <w:szCs w:val="21"/>
-        </w:rPr>
-        <w:t xml:space="preserve">4.  </w:t>
-      </w:r>
-      <w:r>
-        <w:rPr>
-          <w:sz w:val="21"/>
-          <w:szCs w:val="21"/>
-        </w:rPr>
-        <w:t xml:space="preserve">A)  A prime number</w:t>
-      </w:r>
-      <w:r>
-        <w:rPr>
-          <w:i/>
-          <w:iCs/>
-          <w:color w:val="5F6F80"/>
-          <w:sz w:val="19"/>
-          <w:szCs w:val="19"/>
-        </w:rPr>
-        <w:t xml:space="preserve">  — A prime number has exactly two factors: 1 and itself. A composite number has more than two factors.</w:t>
-      </w:r>
-    </w:p>
-    <w:p>
-      <w:pPr>
-        <w:pStyle w:val="Heading2"/>
-        <w:spacing w:after="80" w:before="180"/>
-      </w:pPr>
-      <w:r>
-        <w:rPr>
-          <w:b/>
-          <w:bCs/>
-          <w:color w:val="12355B"/>
-          <w:sz w:val="24"/>
-          <w:szCs w:val="24"/>
-        </w:rPr>
-        <w:t xml:space="preserve">Exit Ticket</w:t>
-      </w:r>
-    </w:p>
-    <w:p>
-      <w:pPr>
-        <w:spacing w:after="80"/>
-      </w:pPr>
-      <w:r>
-        <w:rPr>
-          <w:sz w:val="21"/>
-          <w:szCs w:val="21"/>
-        </w:rPr>
-        <w:t xml:space="preserve">A)  2 × 2 × 2 × 5</w:t>
-      </w:r>
-      <w:r>
-        <w:rPr>
-          <w:i/>
-          <w:iCs/>
-          <w:color w:val="5F6F80"/>
-          <w:sz w:val="19"/>
-          <w:szCs w:val="19"/>
-        </w:rPr>
-        <w:t xml:space="preserve">  — 40 = 2 × 20 = 2 × 2 × 10 = 2 × 2 × 2 × 5. All factors (2, 2, 2, 5) are prime.</w:t>
       </w:r>
     </w:p>
     <w:sectPr>

</xml_diff>